<commit_message>
Report: add Gate 4 systematic-bias table (log BA vs OQ Table 6) with canonical & sub-segment columns for v1/v2
Bias/Bland-Altman were already computed on sub-segment data (gate_summary sub-segment
section + bland_altman_plots_subsegment/); this surfaces the OQ-vs-PCCT bias comparison
in the statistical-method doc/deck with the same canonical/sub-segment x v1/v2 layout as
the wCV tables. Plaque bias grew v1->v2 and does not shrink on sub-segment (bias is within
the shared centerline, not the traced-extent tail).

Co-Authored-By: Claude Opus 4.8 (1M context) <noreply@anthropic.com>
</commit_message>
<xml_diff>
--- a/PCCT_Statistical_Methods_and_Results.docx
+++ b/PCCT_Statistical_Methods_and_Results.docx
@@ -7195,7 +7195,7 @@
               <w:rPr>
                 <w:sz w:val="18"/>
               </w:rPr>
-              <w:t>12.6 P/P</w:t>
+              <w:t>12.6 P/F</w:t>
             </w:r>
           </w:p>
         </w:tc>
@@ -7301,7 +7301,484 @@
         <w:pStyle w:val="Heading1"/>
       </w:pPr>
       <w:r>
-        <w:t>8. Interpretation</w:t>
+        <w:t>8. Gate 4 — systematic bias (log-scale Bland-Altman) vs OQ Table 6</w:t>
+      </w:r>
+    </w:p>
+    <w:p>
+      <w:r>
+        <w:rPr>
+          <w:b w:val="0"/>
+          <w:i w:val="0"/>
+        </w:rPr>
+        <w:t>Systematic PCCT−EID bias Δ on the log(x+1), length-normalized scale (the Gate-4 quantity, separated from dispersion). Acceptance: PCCT bias 95% CI overlaps the 730-CVV-040 Table 6 inter-observer bias 95% CI (which essentially includes 0). Plaque endpoints only (Table 6 provides plaque BA references; process-output bias has no OQ BA reference). P=overlap/pass, F=no overlap/fail.</w:t>
+      </w:r>
+    </w:p>
+    <w:tbl>
+      <w:tblPr>
+        <w:tblStyle w:val="LightGrid-Accent1"/>
+        <w:tblW w:type="auto" w:w="0"/>
+        <w:tblLook w:firstColumn="1" w:firstRow="1" w:lastColumn="0" w:lastRow="0" w:noHBand="0" w:noVBand="1" w:val="04A0"/>
+      </w:tblPr>
+      <w:tblGrid>
+        <w:gridCol w:w="1440"/>
+        <w:gridCol w:w="1440"/>
+        <w:gridCol w:w="1440"/>
+        <w:gridCol w:w="1440"/>
+        <w:gridCol w:w="1440"/>
+        <w:gridCol w:w="1440"/>
+      </w:tblGrid>
+      <w:tr>
+        <w:tc>
+          <w:tcPr>
+            <w:tcW w:type="dxa" w:w="1440"/>
+          </w:tcPr>
+          <w:p>
+            <w:r/>
+            <w:r>
+              <w:rPr>
+                <w:b/>
+                <w:sz w:val="18"/>
+              </w:rPr>
+              <w:t>Endpoint</w:t>
+            </w:r>
+          </w:p>
+        </w:tc>
+        <w:tc>
+          <w:tcPr>
+            <w:tcW w:type="dxa" w:w="1440"/>
+          </w:tcPr>
+          <w:p>
+            <w:r/>
+            <w:r>
+              <w:rPr>
+                <w:b/>
+                <w:sz w:val="18"/>
+              </w:rPr>
+              <w:t>OQ bias [95% CI]</w:t>
+            </w:r>
+          </w:p>
+        </w:tc>
+        <w:tc>
+          <w:tcPr>
+            <w:tcW w:type="dxa" w:w="1440"/>
+          </w:tcPr>
+          <w:p>
+            <w:r/>
+            <w:r>
+              <w:rPr>
+                <w:b/>
+                <w:sz w:val="18"/>
+              </w:rPr>
+              <w:t>v1 canonical</w:t>
+            </w:r>
+          </w:p>
+        </w:tc>
+        <w:tc>
+          <w:tcPr>
+            <w:tcW w:type="dxa" w:w="1440"/>
+          </w:tcPr>
+          <w:p>
+            <w:r/>
+            <w:r>
+              <w:rPr>
+                <w:b/>
+                <w:sz w:val="18"/>
+              </w:rPr>
+              <w:t>v1 sub-seg</w:t>
+            </w:r>
+          </w:p>
+        </w:tc>
+        <w:tc>
+          <w:tcPr>
+            <w:tcW w:type="dxa" w:w="1440"/>
+          </w:tcPr>
+          <w:p>
+            <w:r/>
+            <w:r>
+              <w:rPr>
+                <w:b/>
+                <w:sz w:val="18"/>
+              </w:rPr>
+              <w:t>v2 canonical</w:t>
+            </w:r>
+          </w:p>
+        </w:tc>
+        <w:tc>
+          <w:tcPr>
+            <w:tcW w:type="dxa" w:w="1440"/>
+          </w:tcPr>
+          <w:p>
+            <w:r/>
+            <w:r>
+              <w:rPr>
+                <w:b/>
+                <w:sz w:val="18"/>
+              </w:rPr>
+              <w:t>v2 sub-seg</w:t>
+            </w:r>
+          </w:p>
+        </w:tc>
+      </w:tr>
+      <w:tr>
+        <w:tc>
+          <w:tcPr>
+            <w:tcW w:type="dxa" w:w="1440"/>
+          </w:tcPr>
+          <w:p>
+            <w:r/>
+            <w:r>
+              <w:rPr>
+                <w:sz w:val="18"/>
+              </w:rPr>
+              <w:t>CALC</w:t>
+            </w:r>
+          </w:p>
+        </w:tc>
+        <w:tc>
+          <w:tcPr>
+            <w:tcW w:type="dxa" w:w="1440"/>
+          </w:tcPr>
+          <w:p>
+            <w:r/>
+            <w:r>
+              <w:rPr>
+                <w:sz w:val="18"/>
+              </w:rPr>
+              <w:t>[-0.01, 0.05]</w:t>
+            </w:r>
+          </w:p>
+        </w:tc>
+        <w:tc>
+          <w:tcPr>
+            <w:tcW w:type="dxa" w:w="1440"/>
+          </w:tcPr>
+          <w:p>
+            <w:r/>
+            <w:r>
+              <w:rPr>
+                <w:sz w:val="18"/>
+              </w:rPr>
+              <w:t>+0.005 [-0.037,+0.045] P</w:t>
+            </w:r>
+          </w:p>
+        </w:tc>
+        <w:tc>
+          <w:tcPr>
+            <w:tcW w:type="dxa" w:w="1440"/>
+          </w:tcPr>
+          <w:p>
+            <w:r/>
+            <w:r>
+              <w:rPr>
+                <w:sz w:val="18"/>
+              </w:rPr>
+              <w:t>+0.079 [+0.051,+0.108] F</w:t>
+            </w:r>
+          </w:p>
+        </w:tc>
+        <w:tc>
+          <w:tcPr>
+            <w:tcW w:type="dxa" w:w="1440"/>
+          </w:tcPr>
+          <w:p>
+            <w:r/>
+            <w:r>
+              <w:rPr>
+                <w:sz w:val="18"/>
+              </w:rPr>
+              <w:t>-0.060 [-0.109,-0.013] F</w:t>
+            </w:r>
+          </w:p>
+        </w:tc>
+        <w:tc>
+          <w:tcPr>
+            <w:tcW w:type="dxa" w:w="1440"/>
+          </w:tcPr>
+          <w:p>
+            <w:r/>
+            <w:r>
+              <w:rPr>
+                <w:sz w:val="18"/>
+              </w:rPr>
+              <w:t>+0.003 [-0.033,+0.038] P</w:t>
+            </w:r>
+          </w:p>
+        </w:tc>
+      </w:tr>
+      <w:tr>
+        <w:tc>
+          <w:tcPr>
+            <w:tcW w:type="dxa" w:w="1440"/>
+          </w:tcPr>
+          <w:p>
+            <w:r/>
+            <w:r>
+              <w:rPr>
+                <w:sz w:val="18"/>
+              </w:rPr>
+              <w:t>LRNC</w:t>
+            </w:r>
+          </w:p>
+        </w:tc>
+        <w:tc>
+          <w:tcPr>
+            <w:tcW w:type="dxa" w:w="1440"/>
+          </w:tcPr>
+          <w:p>
+            <w:r/>
+            <w:r>
+              <w:rPr>
+                <w:sz w:val="18"/>
+              </w:rPr>
+              <w:t>[-0.06, -0.01]</w:t>
+            </w:r>
+          </w:p>
+        </w:tc>
+        <w:tc>
+          <w:tcPr>
+            <w:tcW w:type="dxa" w:w="1440"/>
+          </w:tcPr>
+          <w:p>
+            <w:r/>
+            <w:r>
+              <w:rPr>
+                <w:sz w:val="18"/>
+              </w:rPr>
+              <w:t>+0.026 [-0.021,+0.089] P</w:t>
+            </w:r>
+          </w:p>
+        </w:tc>
+        <w:tc>
+          <w:tcPr>
+            <w:tcW w:type="dxa" w:w="1440"/>
+          </w:tcPr>
+          <w:p>
+            <w:r/>
+            <w:r>
+              <w:rPr>
+                <w:sz w:val="18"/>
+              </w:rPr>
+              <w:t>+0.043 [-0.001,+0.100] F</w:t>
+            </w:r>
+          </w:p>
+        </w:tc>
+        <w:tc>
+          <w:tcPr>
+            <w:tcW w:type="dxa" w:w="1440"/>
+          </w:tcPr>
+          <w:p>
+            <w:r/>
+            <w:r>
+              <w:rPr>
+                <w:sz w:val="18"/>
+              </w:rPr>
+              <w:t>-0.008 [-0.043,+0.034] P</w:t>
+            </w:r>
+          </w:p>
+        </w:tc>
+        <w:tc>
+          <w:tcPr>
+            <w:tcW w:type="dxa" w:w="1440"/>
+          </w:tcPr>
+          <w:p>
+            <w:r/>
+            <w:r>
+              <w:rPr>
+                <w:sz w:val="18"/>
+              </w:rPr>
+              <w:t>+0.009 [-0.023,+0.048] P</w:t>
+            </w:r>
+          </w:p>
+        </w:tc>
+      </w:tr>
+      <w:tr>
+        <w:tc>
+          <w:tcPr>
+            <w:tcW w:type="dxa" w:w="1440"/>
+          </w:tcPr>
+          <w:p>
+            <w:r/>
+            <w:r>
+              <w:rPr>
+                <w:sz w:val="18"/>
+              </w:rPr>
+              <w:t>NonCALC Matrix</w:t>
+            </w:r>
+          </w:p>
+        </w:tc>
+        <w:tc>
+          <w:tcPr>
+            <w:tcW w:type="dxa" w:w="1440"/>
+          </w:tcPr>
+          <w:p>
+            <w:r/>
+            <w:r>
+              <w:rPr>
+                <w:sz w:val="18"/>
+              </w:rPr>
+              <w:t>[-0.19, 0.05]</w:t>
+            </w:r>
+          </w:p>
+        </w:tc>
+        <w:tc>
+          <w:tcPr>
+            <w:tcW w:type="dxa" w:w="1440"/>
+          </w:tcPr>
+          <w:p>
+            <w:r/>
+            <w:r>
+              <w:rPr>
+                <w:sz w:val="18"/>
+              </w:rPr>
+              <w:t>-0.188 [-0.284,-0.096] P</w:t>
+            </w:r>
+          </w:p>
+        </w:tc>
+        <w:tc>
+          <w:tcPr>
+            <w:tcW w:type="dxa" w:w="1440"/>
+          </w:tcPr>
+          <w:p>
+            <w:r/>
+            <w:r>
+              <w:rPr>
+                <w:sz w:val="18"/>
+              </w:rPr>
+              <w:t>-0.167 [-0.255,-0.078] P</w:t>
+            </w:r>
+          </w:p>
+        </w:tc>
+        <w:tc>
+          <w:tcPr>
+            <w:tcW w:type="dxa" w:w="1440"/>
+          </w:tcPr>
+          <w:p>
+            <w:r/>
+            <w:r>
+              <w:rPr>
+                <w:sz w:val="18"/>
+              </w:rPr>
+              <w:t>-0.297 [-0.393,-0.199] F</w:t>
+            </w:r>
+          </w:p>
+        </w:tc>
+        <w:tc>
+          <w:tcPr>
+            <w:tcW w:type="dxa" w:w="1440"/>
+          </w:tcPr>
+          <w:p>
+            <w:r/>
+            <w:r>
+              <w:rPr>
+                <w:sz w:val="18"/>
+              </w:rPr>
+              <w:t>-0.289 [-0.393,-0.188] P</w:t>
+            </w:r>
+          </w:p>
+        </w:tc>
+      </w:tr>
+      <w:tr>
+        <w:tc>
+          <w:tcPr>
+            <w:tcW w:type="dxa" w:w="1440"/>
+          </w:tcPr>
+          <w:p>
+            <w:r/>
+            <w:r>
+              <w:rPr>
+                <w:sz w:val="18"/>
+              </w:rPr>
+              <w:t>Total Plaque</w:t>
+            </w:r>
+          </w:p>
+        </w:tc>
+        <w:tc>
+          <w:tcPr>
+            <w:tcW w:type="dxa" w:w="1440"/>
+          </w:tcPr>
+          <w:p>
+            <w:r/>
+            <w:r>
+              <w:rPr>
+                <w:sz w:val="18"/>
+              </w:rPr>
+              <w:t>[-0.19, 0.08]</w:t>
+            </w:r>
+          </w:p>
+        </w:tc>
+        <w:tc>
+          <w:tcPr>
+            <w:tcW w:type="dxa" w:w="1440"/>
+          </w:tcPr>
+          <w:p>
+            <w:r/>
+            <w:r>
+              <w:rPr>
+                <w:sz w:val="18"/>
+              </w:rPr>
+              <w:t>-0.136 [-0.233,-0.039] P</w:t>
+            </w:r>
+          </w:p>
+        </w:tc>
+        <w:tc>
+          <w:tcPr>
+            <w:tcW w:type="dxa" w:w="1440"/>
+          </w:tcPr>
+          <w:p>
+            <w:r/>
+            <w:r>
+              <w:rPr>
+                <w:sz w:val="18"/>
+              </w:rPr>
+              <w:t>-0.068 [-0.143,+0.014] P</w:t>
+            </w:r>
+          </w:p>
+        </w:tc>
+        <w:tc>
+          <w:tcPr>
+            <w:tcW w:type="dxa" w:w="1440"/>
+          </w:tcPr>
+          <w:p>
+            <w:r/>
+            <w:r>
+              <w:rPr>
+                <w:sz w:val="18"/>
+              </w:rPr>
+              <w:t>-0.276 [-0.376,-0.180] P</w:t>
+            </w:r>
+          </w:p>
+        </w:tc>
+        <w:tc>
+          <w:tcPr>
+            <w:tcW w:type="dxa" w:w="1440"/>
+          </w:tcPr>
+          <w:p>
+            <w:r/>
+            <w:r>
+              <w:rPr>
+                <w:sz w:val="18"/>
+              </w:rPr>
+              <w:t>-0.228 [-0.319,-0.142] P</w:t>
+            </w:r>
+          </w:p>
+        </w:tc>
+      </w:tr>
+    </w:tbl>
+    <w:p>
+      <w:r>
+        <w:rPr>
+          <w:b w:val="0"/>
+          <w:i/>
+        </w:rPr>
+        <w:t>Full BA bias/LoA/proportional-bias detail and the OQ-overlay plots are in gate_results/qualification_report.html (canonical) and the gate_summary.txt sub-segment section + gate_results/bland_altman_plots_subsegment/ (sub-segment). Note the systematic plaque bias grew v1→v2 (07-07 re-work) and does NOT shrink to overlap on sub-segment — the bias is within the shared centerline, not at the traced-extent tail (consistent with the earlier sub-segment finding).</w:t>
+      </w:r>
+    </w:p>
+    <w:p>
+      <w:pPr>
+        <w:pStyle w:val="Heading1"/>
+      </w:pPr>
+      <w:r>
+        <w:t>9. Interpretation</w:t>
       </w:r>
     </w:p>
     <w:p>
@@ -7341,7 +7818,7 @@
         <w:pStyle w:val="Heading1"/>
       </w:pPr>
       <w:r>
-        <w:t>9. Caveats &amp; future work</w:t>
+        <w:t>10. Caveats &amp; future work</w:t>
       </w:r>
     </w:p>
     <w:p>

</xml_diff>

<commit_message>
Gate 4: report untransformed (non-log) bias alongside log, in stat doc + HTML
- gate4_comparison.csv: add untransformed columns (raw bias mm3, % of mean, threshold,
  pass); HTML report renders log (OQ Table 6 overlap) AND untransformed (% of mean vs
  project threshold) side by side.
- Stat doc §8: §8a log (vs OQ Table 6) + §8b untransformed on RAW volumes (matches
  gate_summary/HTML), both with canonical & sub-segment columns for v1/v2. PPT bias slide.
- Untransformed bias now consistent across artifacts (e.g. NonCALC v2 canonical
  -108.9 mm3 / 47% of mean).

Co-Authored-By: Claude Opus 4.8 (1M context) <noreply@anthropic.com>
</commit_message>
<xml_diff>
--- a/PCCT_Statistical_Methods_and_Results.docx
+++ b/PCCT_Statistical_Methods_and_Results.docx
@@ -7301,16 +7301,16 @@
         <w:pStyle w:val="Heading1"/>
       </w:pPr>
       <w:r>
-        <w:t>8. Gate 4 — systematic bias (log-scale Bland-Altman) vs OQ Table 6</w:t>
+        <w:t>8. Gate 4 — systematic bias, both scales (log Bland-Altman &amp; untransformed)</w:t>
       </w:r>
     </w:p>
     <w:p>
       <w:r>
         <w:rPr>
-          <w:b w:val="0"/>
+          <w:b/>
           <w:i w:val="0"/>
         </w:rPr>
-        <w:t>Systematic PCCT−EID bias Δ on the log(x+1), length-normalized scale (the Gate-4 quantity, separated from dispersion). Acceptance: PCCT bias 95% CI overlaps the 730-CVV-040 Table 6 inter-observer bias 95% CI (which essentially includes 0). Plaque endpoints only (Table 6 provides plaque BA references; process-output bias has no OQ BA reference). P=overlap/pass, F=no overlap/fail.</w:t>
+        <w:t>8a. LOG scale — systematic PCCT−EID bias Δ on the log(x+1), length-normalized scale. Acceptance: PCCT bias 95% CI overlaps the 730-CVV-040 Table 6 inter-observer bias 95% CI (which essentially includes 0). Plaque only (Table 6 = plaque BA refs). P=overlap/pass.</w:t>
       </w:r>
     </w:p>
     <w:tbl>
@@ -7759,6 +7759,466 @@
                 <w:sz w:val="18"/>
               </w:rPr>
               <w:t>-0.228 [-0.319,-0.142] P</w:t>
+            </w:r>
+          </w:p>
+        </w:tc>
+      </w:tr>
+    </w:tbl>
+    <w:p>
+      <w:r>
+        <w:rPr>
+          <w:b/>
+          <w:i w:val="0"/>
+        </w:rPr>
+        <w:t>8b. UNTRANSFORMED (non-log) scale — bias as % of mean on RAW (non-normalized) volumes (matches gate_summary / HTML report / the traditional Gate 4), vs the project |bias| &lt; 10% of mean threshold. P=pass. No OQ untransformed BA-bias reference — project-specific criterion. e.g. NonCALC Matrix v2 canonical bias ≈ −108.9 mm³ (47% of mean).</w:t>
+      </w:r>
+    </w:p>
+    <w:tbl>
+      <w:tblPr>
+        <w:tblStyle w:val="LightGrid-Accent1"/>
+        <w:tblW w:type="auto" w:w="0"/>
+        <w:tblLook w:firstColumn="1" w:firstRow="1" w:lastColumn="0" w:lastRow="0" w:noHBand="0" w:noVBand="1" w:val="04A0"/>
+      </w:tblPr>
+      <w:tblGrid>
+        <w:gridCol w:w="1440"/>
+        <w:gridCol w:w="1440"/>
+        <w:gridCol w:w="1440"/>
+        <w:gridCol w:w="1440"/>
+        <w:gridCol w:w="1440"/>
+        <w:gridCol w:w="1440"/>
+      </w:tblGrid>
+      <w:tr>
+        <w:tc>
+          <w:tcPr>
+            <w:tcW w:type="dxa" w:w="1440"/>
+          </w:tcPr>
+          <w:p>
+            <w:r/>
+            <w:r>
+              <w:rPr>
+                <w:b/>
+                <w:sz w:val="18"/>
+              </w:rPr>
+              <w:t>Endpoint</w:t>
+            </w:r>
+          </w:p>
+        </w:tc>
+        <w:tc>
+          <w:tcPr>
+            <w:tcW w:type="dxa" w:w="1440"/>
+          </w:tcPr>
+          <w:p>
+            <w:r/>
+            <w:r>
+              <w:rPr>
+                <w:b/>
+                <w:sz w:val="18"/>
+              </w:rPr>
+              <w:t>threshold</w:t>
+            </w:r>
+          </w:p>
+        </w:tc>
+        <w:tc>
+          <w:tcPr>
+            <w:tcW w:type="dxa" w:w="1440"/>
+          </w:tcPr>
+          <w:p>
+            <w:r/>
+            <w:r>
+              <w:rPr>
+                <w:b/>
+                <w:sz w:val="18"/>
+              </w:rPr>
+              <w:t>v1 canonical</w:t>
+            </w:r>
+          </w:p>
+        </w:tc>
+        <w:tc>
+          <w:tcPr>
+            <w:tcW w:type="dxa" w:w="1440"/>
+          </w:tcPr>
+          <w:p>
+            <w:r/>
+            <w:r>
+              <w:rPr>
+                <w:b/>
+                <w:sz w:val="18"/>
+              </w:rPr>
+              <w:t>v1 sub-seg</w:t>
+            </w:r>
+          </w:p>
+        </w:tc>
+        <w:tc>
+          <w:tcPr>
+            <w:tcW w:type="dxa" w:w="1440"/>
+          </w:tcPr>
+          <w:p>
+            <w:r/>
+            <w:r>
+              <w:rPr>
+                <w:b/>
+                <w:sz w:val="18"/>
+              </w:rPr>
+              <w:t>v2 canonical</w:t>
+            </w:r>
+          </w:p>
+        </w:tc>
+        <w:tc>
+          <w:tcPr>
+            <w:tcW w:type="dxa" w:w="1440"/>
+          </w:tcPr>
+          <w:p>
+            <w:r/>
+            <w:r>
+              <w:rPr>
+                <w:b/>
+                <w:sz w:val="18"/>
+              </w:rPr>
+              <w:t>v2 sub-seg</w:t>
+            </w:r>
+          </w:p>
+        </w:tc>
+      </w:tr>
+      <w:tr>
+        <w:tc>
+          <w:tcPr>
+            <w:tcW w:type="dxa" w:w="1440"/>
+          </w:tcPr>
+          <w:p>
+            <w:r/>
+            <w:r>
+              <w:rPr>
+                <w:sz w:val="18"/>
+              </w:rPr>
+              <w:t>CALC</w:t>
+            </w:r>
+          </w:p>
+        </w:tc>
+        <w:tc>
+          <w:tcPr>
+            <w:tcW w:type="dxa" w:w="1440"/>
+          </w:tcPr>
+          <w:p>
+            <w:r/>
+            <w:r>
+              <w:rPr>
+                <w:sz w:val="18"/>
+              </w:rPr>
+              <w:t>&lt;10%</w:t>
+            </w:r>
+          </w:p>
+        </w:tc>
+        <w:tc>
+          <w:tcPr>
+            <w:tcW w:type="dxa" w:w="1440"/>
+          </w:tcPr>
+          <w:p>
+            <w:r/>
+            <w:r>
+              <w:rPr>
+                <w:sz w:val="18"/>
+              </w:rPr>
+              <w:t>19.2% F</w:t>
+            </w:r>
+          </w:p>
+        </w:tc>
+        <w:tc>
+          <w:tcPr>
+            <w:tcW w:type="dxa" w:w="1440"/>
+          </w:tcPr>
+          <w:p>
+            <w:r/>
+            <w:r>
+              <w:rPr>
+                <w:sz w:val="18"/>
+              </w:rPr>
+              <w:t>21.3% F</w:t>
+            </w:r>
+          </w:p>
+        </w:tc>
+        <w:tc>
+          <w:tcPr>
+            <w:tcW w:type="dxa" w:w="1440"/>
+          </w:tcPr>
+          <w:p>
+            <w:r/>
+            <w:r>
+              <w:rPr>
+                <w:sz w:val="18"/>
+              </w:rPr>
+              <w:t>2.7% P</w:t>
+            </w:r>
+          </w:p>
+        </w:tc>
+        <w:tc>
+          <w:tcPr>
+            <w:tcW w:type="dxa" w:w="1440"/>
+          </w:tcPr>
+          <w:p>
+            <w:r/>
+            <w:r>
+              <w:rPr>
+                <w:sz w:val="18"/>
+              </w:rPr>
+              <w:t>0.2% P</w:t>
+            </w:r>
+          </w:p>
+        </w:tc>
+      </w:tr>
+      <w:tr>
+        <w:tc>
+          <w:tcPr>
+            <w:tcW w:type="dxa" w:w="1440"/>
+          </w:tcPr>
+          <w:p>
+            <w:r/>
+            <w:r>
+              <w:rPr>
+                <w:sz w:val="18"/>
+              </w:rPr>
+              <w:t>LRNC</w:t>
+            </w:r>
+          </w:p>
+        </w:tc>
+        <w:tc>
+          <w:tcPr>
+            <w:tcW w:type="dxa" w:w="1440"/>
+          </w:tcPr>
+          <w:p>
+            <w:r/>
+            <w:r>
+              <w:rPr>
+                <w:sz w:val="18"/>
+              </w:rPr>
+              <w:t>&lt;10%</w:t>
+            </w:r>
+          </w:p>
+        </w:tc>
+        <w:tc>
+          <w:tcPr>
+            <w:tcW w:type="dxa" w:w="1440"/>
+          </w:tcPr>
+          <w:p>
+            <w:r/>
+            <w:r>
+              <w:rPr>
+                <w:sz w:val="18"/>
+              </w:rPr>
+              <w:t>21.0% F</w:t>
+            </w:r>
+          </w:p>
+        </w:tc>
+        <w:tc>
+          <w:tcPr>
+            <w:tcW w:type="dxa" w:w="1440"/>
+          </w:tcPr>
+          <w:p>
+            <w:r/>
+            <w:r>
+              <w:rPr>
+                <w:sz w:val="18"/>
+              </w:rPr>
+              <w:t>29.7% F</w:t>
+            </w:r>
+          </w:p>
+        </w:tc>
+        <w:tc>
+          <w:tcPr>
+            <w:tcW w:type="dxa" w:w="1440"/>
+          </w:tcPr>
+          <w:p>
+            <w:r/>
+            <w:r>
+              <w:rPr>
+                <w:sz w:val="18"/>
+              </w:rPr>
+              <w:t>17.2% F</w:t>
+            </w:r>
+          </w:p>
+        </w:tc>
+        <w:tc>
+          <w:tcPr>
+            <w:tcW w:type="dxa" w:w="1440"/>
+          </w:tcPr>
+          <w:p>
+            <w:r/>
+            <w:r>
+              <w:rPr>
+                <w:sz w:val="18"/>
+              </w:rPr>
+              <w:t>6.6% P</w:t>
+            </w:r>
+          </w:p>
+        </w:tc>
+      </w:tr>
+      <w:tr>
+        <w:tc>
+          <w:tcPr>
+            <w:tcW w:type="dxa" w:w="1440"/>
+          </w:tcPr>
+          <w:p>
+            <w:r/>
+            <w:r>
+              <w:rPr>
+                <w:sz w:val="18"/>
+              </w:rPr>
+              <w:t>NonCALC Matrix</w:t>
+            </w:r>
+          </w:p>
+        </w:tc>
+        <w:tc>
+          <w:tcPr>
+            <w:tcW w:type="dxa" w:w="1440"/>
+          </w:tcPr>
+          <w:p>
+            <w:r/>
+            <w:r>
+              <w:rPr>
+                <w:sz w:val="18"/>
+              </w:rPr>
+              <w:t>&lt;10%</w:t>
+            </w:r>
+          </w:p>
+        </w:tc>
+        <w:tc>
+          <w:tcPr>
+            <w:tcW w:type="dxa" w:w="1440"/>
+          </w:tcPr>
+          <w:p>
+            <w:r/>
+            <w:r>
+              <w:rPr>
+                <w:sz w:val="18"/>
+              </w:rPr>
+              <w:t>24.6% F</w:t>
+            </w:r>
+          </w:p>
+        </w:tc>
+        <w:tc>
+          <w:tcPr>
+            <w:tcW w:type="dxa" w:w="1440"/>
+          </w:tcPr>
+          <w:p>
+            <w:r/>
+            <w:r>
+              <w:rPr>
+                <w:sz w:val="18"/>
+              </w:rPr>
+              <w:t>36.6% F</w:t>
+            </w:r>
+          </w:p>
+        </w:tc>
+        <w:tc>
+          <w:tcPr>
+            <w:tcW w:type="dxa" w:w="1440"/>
+          </w:tcPr>
+          <w:p>
+            <w:r/>
+            <w:r>
+              <w:rPr>
+                <w:sz w:val="18"/>
+              </w:rPr>
+              <w:t>47.0% F</w:t>
+            </w:r>
+          </w:p>
+        </w:tc>
+        <w:tc>
+          <w:tcPr>
+            <w:tcW w:type="dxa" w:w="1440"/>
+          </w:tcPr>
+          <w:p>
+            <w:r/>
+            <w:r>
+              <w:rPr>
+                <w:sz w:val="18"/>
+              </w:rPr>
+              <w:t>64.8% F</w:t>
+            </w:r>
+          </w:p>
+        </w:tc>
+      </w:tr>
+      <w:tr>
+        <w:tc>
+          <w:tcPr>
+            <w:tcW w:type="dxa" w:w="1440"/>
+          </w:tcPr>
+          <w:p>
+            <w:r/>
+            <w:r>
+              <w:rPr>
+                <w:sz w:val="18"/>
+              </w:rPr>
+              <w:t>Total Plaque</w:t>
+            </w:r>
+          </w:p>
+        </w:tc>
+        <w:tc>
+          <w:tcPr>
+            <w:tcW w:type="dxa" w:w="1440"/>
+          </w:tcPr>
+          <w:p>
+            <w:r/>
+            <w:r>
+              <w:rPr>
+                <w:sz w:val="18"/>
+              </w:rPr>
+              <w:t>&lt;10%</w:t>
+            </w:r>
+          </w:p>
+        </w:tc>
+        <w:tc>
+          <w:tcPr>
+            <w:tcW w:type="dxa" w:w="1440"/>
+          </w:tcPr>
+          <w:p>
+            <w:r/>
+            <w:r>
+              <w:rPr>
+                <w:sz w:val="18"/>
+              </w:rPr>
+              <w:t>7.3% P</w:t>
+            </w:r>
+          </w:p>
+        </w:tc>
+        <w:tc>
+          <w:tcPr>
+            <w:tcW w:type="dxa" w:w="1440"/>
+          </w:tcPr>
+          <w:p>
+            <w:r/>
+            <w:r>
+              <w:rPr>
+                <w:sz w:val="18"/>
+              </w:rPr>
+              <w:t>13.0% F</w:t>
+            </w:r>
+          </w:p>
+        </w:tc>
+        <w:tc>
+          <w:tcPr>
+            <w:tcW w:type="dxa" w:w="1440"/>
+          </w:tcPr>
+          <w:p>
+            <w:r/>
+            <w:r>
+              <w:rPr>
+                <w:sz w:val="18"/>
+              </w:rPr>
+              <w:t>31.3% F</w:t>
+            </w:r>
+          </w:p>
+        </w:tc>
+        <w:tc>
+          <w:tcPr>
+            <w:tcW w:type="dxa" w:w="1440"/>
+          </w:tcPr>
+          <w:p>
+            <w:r/>
+            <w:r>
+              <w:rPr>
+                <w:sz w:val="18"/>
+              </w:rPr>
+              <w:t>42.3% F</w:t>
             </w:r>
           </w:p>
         </w:tc>

</xml_diff>

<commit_message>
Add Gate 4 v1->v2 per-patient shift figures (untransformed & log)
- scripts/generate_gate4_shift_figs.py: per-endpoint 2-panel Bland-Altman figure
  (untransformed mm3 | log(x+1)) with v1 (light) and v2 (dark) points, per-patient
  shift arrows, and v1/v2 mean-bias lines. 7 endpoints -> gate_results/gate4_v1v2_shift/.
- Embedded in the HTML report (Gate 4 section) and the stat-methods Word doc (§8c).

Visualizes the v1->v2 change: e.g. NonCALC bias -65.2->-108.9 mm3 (untransformed),
-0.18->-0.50 (log) as a coherent downward shift of the per-patient cloud.

Co-Authored-By: Claude Opus 4.8 (1M context) <noreply@anthropic.com>
</commit_message>
<xml_diff>
--- a/PCCT_Statistical_Methods_and_Results.docx
+++ b/PCCT_Statistical_Methods_and_Results.docx
@@ -8231,6 +8231,267 @@
           <w:i/>
         </w:rPr>
         <w:t>Full BA bias/LoA/proportional-bias detail and the OQ-overlay plots are in gate_results/qualification_report.html (canonical) and the gate_summary.txt sub-segment section + gate_results/bland_altman_plots_subsegment/ (sub-segment). Note the systematic plaque bias grew v1→v2 (07-07 re-work) and does NOT shrink to overlap on sub-segment — the bias is within the shared centerline, not at the traced-extent tail (consistent with the earlier sub-segment finding).</w:t>
+      </w:r>
+    </w:p>
+    <w:p>
+      <w:r>
+        <w:rPr>
+          <w:b/>
+          <w:i w:val="0"/>
+        </w:rPr>
+        <w:t>8c. Per-patient v1→v2 shift (untransformed &amp; log). v1 = light, v2 = dark; grey arrows show each patient's shift; dashed = v1 mean bias, solid = v2 mean bias.</w:t>
+      </w:r>
+    </w:p>
+    <w:p>
+      <w:r>
+        <w:drawing>
+          <wp:inline xmlns:a="http://schemas.openxmlformats.org/drawingml/2006/main" xmlns:pic="http://schemas.openxmlformats.org/drawingml/2006/picture">
+            <wp:extent cx="6217920" cy="2620271"/>
+            <wp:docPr id="1" name="Picture 1"/>
+            <wp:cNvGraphicFramePr>
+              <a:graphicFrameLocks noChangeAspect="1"/>
+            </wp:cNvGraphicFramePr>
+            <a:graphic>
+              <a:graphicData uri="http://schemas.openxmlformats.org/drawingml/2006/picture">
+                <pic:pic>
+                  <pic:nvPicPr>
+                    <pic:cNvPr id="0" name="BA_shift_CALCVol.png"/>
+                    <pic:cNvPicPr/>
+                  </pic:nvPicPr>
+                  <pic:blipFill>
+                    <a:blip r:embed="rId9"/>
+                    <a:stretch>
+                      <a:fillRect/>
+                    </a:stretch>
+                  </pic:blipFill>
+                  <pic:spPr>
+                    <a:xfrm>
+                      <a:off x="0" y="0"/>
+                      <a:ext cx="6217920" cy="2620271"/>
+                    </a:xfrm>
+                    <a:prstGeom prst="rect"/>
+                  </pic:spPr>
+                </pic:pic>
+              </a:graphicData>
+            </a:graphic>
+          </wp:inline>
+        </w:drawing>
+      </w:r>
+    </w:p>
+    <w:p>
+      <w:r>
+        <w:drawing>
+          <wp:inline xmlns:a="http://schemas.openxmlformats.org/drawingml/2006/main" xmlns:pic="http://schemas.openxmlformats.org/drawingml/2006/picture">
+            <wp:extent cx="6217920" cy="2620271"/>
+            <wp:docPr id="2" name="Picture 2"/>
+            <wp:cNvGraphicFramePr>
+              <a:graphicFrameLocks noChangeAspect="1"/>
+            </wp:cNvGraphicFramePr>
+            <a:graphic>
+              <a:graphicData uri="http://schemas.openxmlformats.org/drawingml/2006/picture">
+                <pic:pic>
+                  <pic:nvPicPr>
+                    <pic:cNvPr id="0" name="BA_shift_LRNCVol.png"/>
+                    <pic:cNvPicPr/>
+                  </pic:nvPicPr>
+                  <pic:blipFill>
+                    <a:blip r:embed="rId10"/>
+                    <a:stretch>
+                      <a:fillRect/>
+                    </a:stretch>
+                  </pic:blipFill>
+                  <pic:spPr>
+                    <a:xfrm>
+                      <a:off x="0" y="0"/>
+                      <a:ext cx="6217920" cy="2620271"/>
+                    </a:xfrm>
+                    <a:prstGeom prst="rect"/>
+                  </pic:spPr>
+                </pic:pic>
+              </a:graphicData>
+            </a:graphic>
+          </wp:inline>
+        </w:drawing>
+      </w:r>
+    </w:p>
+    <w:p>
+      <w:r>
+        <w:drawing>
+          <wp:inline xmlns:a="http://schemas.openxmlformats.org/drawingml/2006/main" xmlns:pic="http://schemas.openxmlformats.org/drawingml/2006/picture">
+            <wp:extent cx="6217920" cy="2620271"/>
+            <wp:docPr id="3" name="Picture 3"/>
+            <wp:cNvGraphicFramePr>
+              <a:graphicFrameLocks noChangeAspect="1"/>
+            </wp:cNvGraphicFramePr>
+            <a:graphic>
+              <a:graphicData uri="http://schemas.openxmlformats.org/drawingml/2006/picture">
+                <pic:pic>
+                  <pic:nvPicPr>
+                    <pic:cNvPr id="0" name="BA_shift_NonCALCMATXVol.png"/>
+                    <pic:cNvPicPr/>
+                  </pic:nvPicPr>
+                  <pic:blipFill>
+                    <a:blip r:embed="rId11"/>
+                    <a:stretch>
+                      <a:fillRect/>
+                    </a:stretch>
+                  </pic:blipFill>
+                  <pic:spPr>
+                    <a:xfrm>
+                      <a:off x="0" y="0"/>
+                      <a:ext cx="6217920" cy="2620271"/>
+                    </a:xfrm>
+                    <a:prstGeom prst="rect"/>
+                  </pic:spPr>
+                </pic:pic>
+              </a:graphicData>
+            </a:graphic>
+          </wp:inline>
+        </w:drawing>
+      </w:r>
+    </w:p>
+    <w:p>
+      <w:r>
+        <w:drawing>
+          <wp:inline xmlns:a="http://schemas.openxmlformats.org/drawingml/2006/main" xmlns:pic="http://schemas.openxmlformats.org/drawingml/2006/picture">
+            <wp:extent cx="6217920" cy="2620271"/>
+            <wp:docPr id="4" name="Picture 4"/>
+            <wp:cNvGraphicFramePr>
+              <a:graphicFrameLocks noChangeAspect="1"/>
+            </wp:cNvGraphicFramePr>
+            <a:graphic>
+              <a:graphicData uri="http://schemas.openxmlformats.org/drawingml/2006/picture">
+                <pic:pic>
+                  <pic:nvPicPr>
+                    <pic:cNvPr id="0" name="BA_shift_TotalPlaqueVolume.png"/>
+                    <pic:cNvPicPr/>
+                  </pic:nvPicPr>
+                  <pic:blipFill>
+                    <a:blip r:embed="rId12"/>
+                    <a:stretch>
+                      <a:fillRect/>
+                    </a:stretch>
+                  </pic:blipFill>
+                  <pic:spPr>
+                    <a:xfrm>
+                      <a:off x="0" y="0"/>
+                      <a:ext cx="6217920" cy="2620271"/>
+                    </a:xfrm>
+                    <a:prstGeom prst="rect"/>
+                  </pic:spPr>
+                </pic:pic>
+              </a:graphicData>
+            </a:graphic>
+          </wp:inline>
+        </w:drawing>
+      </w:r>
+    </w:p>
+    <w:p>
+      <w:r>
+        <w:drawing>
+          <wp:inline xmlns:a="http://schemas.openxmlformats.org/drawingml/2006/main" xmlns:pic="http://schemas.openxmlformats.org/drawingml/2006/picture">
+            <wp:extent cx="6217920" cy="2620271"/>
+            <wp:docPr id="5" name="Picture 5"/>
+            <wp:cNvGraphicFramePr>
+              <a:graphicFrameLocks noChangeAspect="1"/>
+            </wp:cNvGraphicFramePr>
+            <a:graphic>
+              <a:graphicData uri="http://schemas.openxmlformats.org/drawingml/2006/picture">
+                <pic:pic>
+                  <pic:nvPicPr>
+                    <pic:cNvPr id="0" name="BA_shift_LumenVol.png"/>
+                    <pic:cNvPicPr/>
+                  </pic:nvPicPr>
+                  <pic:blipFill>
+                    <a:blip r:embed="rId13"/>
+                    <a:stretch>
+                      <a:fillRect/>
+                    </a:stretch>
+                  </pic:blipFill>
+                  <pic:spPr>
+                    <a:xfrm>
+                      <a:off x="0" y="0"/>
+                      <a:ext cx="6217920" cy="2620271"/>
+                    </a:xfrm>
+                    <a:prstGeom prst="rect"/>
+                  </pic:spPr>
+                </pic:pic>
+              </a:graphicData>
+            </a:graphic>
+          </wp:inline>
+        </w:drawing>
+      </w:r>
+    </w:p>
+    <w:p>
+      <w:r>
+        <w:drawing>
+          <wp:inline xmlns:a="http://schemas.openxmlformats.org/drawingml/2006/main" xmlns:pic="http://schemas.openxmlformats.org/drawingml/2006/picture">
+            <wp:extent cx="6217920" cy="2620271"/>
+            <wp:docPr id="6" name="Picture 6"/>
+            <wp:cNvGraphicFramePr>
+              <a:graphicFrameLocks noChangeAspect="1"/>
+            </wp:cNvGraphicFramePr>
+            <a:graphic>
+              <a:graphicData uri="http://schemas.openxmlformats.org/drawingml/2006/picture">
+                <pic:pic>
+                  <pic:nvPicPr>
+                    <pic:cNvPr id="0" name="BA_shift_WallVol.png"/>
+                    <pic:cNvPicPr/>
+                  </pic:nvPicPr>
+                  <pic:blipFill>
+                    <a:blip r:embed="rId14"/>
+                    <a:stretch>
+                      <a:fillRect/>
+                    </a:stretch>
+                  </pic:blipFill>
+                  <pic:spPr>
+                    <a:xfrm>
+                      <a:off x="0" y="0"/>
+                      <a:ext cx="6217920" cy="2620271"/>
+                    </a:xfrm>
+                    <a:prstGeom prst="rect"/>
+                  </pic:spPr>
+                </pic:pic>
+              </a:graphicData>
+            </a:graphic>
+          </wp:inline>
+        </w:drawing>
+      </w:r>
+    </w:p>
+    <w:p>
+      <w:r>
+        <w:drawing>
+          <wp:inline xmlns:a="http://schemas.openxmlformats.org/drawingml/2006/main" xmlns:pic="http://schemas.openxmlformats.org/drawingml/2006/picture">
+            <wp:extent cx="6217920" cy="2620271"/>
+            <wp:docPr id="7" name="Picture 7"/>
+            <wp:cNvGraphicFramePr>
+              <a:graphicFrameLocks noChangeAspect="1"/>
+            </wp:cNvGraphicFramePr>
+            <a:graphic>
+              <a:graphicData uri="http://schemas.openxmlformats.org/drawingml/2006/picture">
+                <pic:pic>
+                  <pic:nvPicPr>
+                    <pic:cNvPr id="0" name="BA_shift_VesselVol.png"/>
+                    <pic:cNvPicPr/>
+                  </pic:nvPicPr>
+                  <pic:blipFill>
+                    <a:blip r:embed="rId15"/>
+                    <a:stretch>
+                      <a:fillRect/>
+                    </a:stretch>
+                  </pic:blipFill>
+                  <pic:spPr>
+                    <a:xfrm>
+                      <a:off x="0" y="0"/>
+                      <a:ext cx="6217920" cy="2620271"/>
+                    </a:xfrm>
+                    <a:prstGeom prst="rect"/>
+                  </pic:spPr>
+                </pic:pic>
+              </a:graphicData>
+            </a:graphic>
+          </wp:inline>
+        </w:drawing>
       </w:r>
     </w:p>
     <w:p>

</xml_diff>

<commit_message>
Recover PT-136 -> v2 sub-segment N=25
PT-136 was the one 25-cohort case missing from v2 sub-seg. Its v2 workitems carry two
LeftCoronary target traces (LAD+Diagonal1 and Circumflex+LeftMarginal1 - verified disjoint),
plus a PCCT-only RightCoronary (EID never traced RCA). Recovered by running the intersection
pipeline per left target with explicit study specs (bypassing the wrapper's single-target
check) and summing; RCA excluded (unmatched). Extent-matched Len 155.3 mm both scanners;
PCCT TotalPlaque 56.5 / EID 84.2, NonCALCMATX 47.0 / 71.4 mm3 (PCCT lower, consistent).

Regenerated all v2 sub-seg outputs at N=25: paired_data_subsegment.csv, gate3_subseg_comparison,
scanner_attributable_subsegment, gate_summary, subseg BA plots, HTML report, cohort table,
and the stat methods docx (§5 v2 sub-seg N=25; §8b NonCALC -111.2, Total -111.1 mm3).
Subseg source CSVs live under the git-ignored workitem_summaries/subsegment/.

Co-Authored-By: Claude Opus 4.8 (1M context) <noreply@anthropic.com>
</commit_message>
<xml_diff>
--- a/PCCT_Statistical_Methods_and_Results.docx
+++ b/PCCT_Statistical_Methods_and_Results.docx
@@ -2192,7 +2192,7 @@
           <w:b/>
           <w:i w:val="0"/>
         </w:rPr>
-        <w:t>v2 sub-seg  (N=24):</w:t>
+        <w:t>v2 sub-seg  (N=25):</w:t>
       </w:r>
     </w:p>
     <w:tbl>
@@ -2374,7 +2374,7 @@
               <w:rPr>
                 <w:sz w:val="18"/>
               </w:rPr>
-              <w:t>-0.014</w:t>
+              <w:t>-0.017</w:t>
             </w:r>
           </w:p>
         </w:tc>
@@ -2388,7 +2388,7 @@
               <w:rPr>
                 <w:sz w:val="18"/>
               </w:rPr>
-              <w:t>0.01040</w:t>
+              <w:t>0.01014</w:t>
             </w:r>
           </w:p>
         </w:tc>
@@ -2402,7 +2402,7 @@
               <w:rPr>
                 <w:sz w:val="18"/>
               </w:rPr>
-              <w:t>0.01075</w:t>
+              <w:t>0.01042</w:t>
             </w:r>
           </w:p>
         </w:tc>
@@ -2430,7 +2430,7 @@
               <w:rPr>
                 <w:sz w:val="18"/>
               </w:rPr>
-              <w:t>0.00515</w:t>
+              <w:t>0.00481</w:t>
             </w:r>
           </w:p>
         </w:tc>
@@ -2444,6 +2444,20 @@
               <w:rPr>
                 <w:sz w:val="18"/>
               </w:rPr>
+              <w:t>10.1</w:t>
+            </w:r>
+          </w:p>
+        </w:tc>
+        <w:tc>
+          <w:tcPr>
+            <w:tcW w:type="dxa" w:w="960"/>
+          </w:tcPr>
+          <w:p>
+            <w:r/>
+            <w:r>
+              <w:rPr>
+                <w:sz w:val="18"/>
+              </w:rPr>
               <w:t>10.2</w:t>
             </w:r>
           </w:p>
@@ -2458,21 +2472,7 @@
               <w:rPr>
                 <w:sz w:val="18"/>
               </w:rPr>
-              <w:t>10.4</w:t>
-            </w:r>
-          </w:p>
-        </w:tc>
-        <w:tc>
-          <w:tcPr>
-            <w:tcW w:type="dxa" w:w="960"/>
-          </w:tcPr>
-          <w:p>
-            <w:r/>
-            <w:r>
-              <w:rPr>
-                <w:sz w:val="18"/>
-              </w:rPr>
-              <w:t>7.2</w:t>
+              <w:t>6.9</w:t>
             </w:r>
           </w:p>
         </w:tc>
@@ -2502,7 +2502,7 @@
               <w:rPr>
                 <w:sz w:val="18"/>
               </w:rPr>
-              <w:t>-0.172</w:t>
+              <w:t>-0.171</w:t>
             </w:r>
           </w:p>
         </w:tc>
@@ -2516,7 +2516,7 @@
               <w:rPr>
                 <w:sz w:val="18"/>
               </w:rPr>
-              <w:t>0.03160</w:t>
+              <w:t>0.03077</w:t>
             </w:r>
           </w:p>
         </w:tc>
@@ -2530,7 +2530,7 @@
               <w:rPr>
                 <w:sz w:val="18"/>
               </w:rPr>
-              <w:t>0.01751</w:t>
+              <w:t>0.01680</w:t>
             </w:r>
           </w:p>
         </w:tc>
@@ -2558,7 +2558,7 @@
               <w:rPr>
                 <w:sz w:val="18"/>
               </w:rPr>
-              <w:t>0.00050</w:t>
+              <w:t>-0.00022</w:t>
             </w:r>
           </w:p>
         </w:tc>
@@ -2572,7 +2572,7 @@
               <w:rPr>
                 <w:sz w:val="18"/>
               </w:rPr>
-              <w:t>17.9</w:t>
+              <w:t>17.7</w:t>
             </w:r>
           </w:p>
         </w:tc>
@@ -2586,7 +2586,7 @@
               <w:rPr>
                 <w:sz w:val="18"/>
               </w:rPr>
-              <w:t>13.3</w:t>
+              <w:t>13.0</w:t>
             </w:r>
           </w:p>
         </w:tc>
@@ -2600,7 +2600,7 @@
               <w:rPr>
                 <w:sz w:val="18"/>
               </w:rPr>
-              <w:t>2.2</w:t>
+              <w:t>0.0</w:t>
             </w:r>
           </w:p>
         </w:tc>
@@ -2630,7 +2630,7 @@
               <w:rPr>
                 <w:sz w:val="18"/>
               </w:rPr>
-              <w:t>-0.069</w:t>
+              <w:t>-0.072</w:t>
             </w:r>
           </w:p>
         </w:tc>
@@ -2644,7 +2644,7 @@
               <w:rPr>
                 <w:sz w:val="18"/>
               </w:rPr>
-              <w:t>0.01026</w:t>
+              <w:t>0.01028</w:t>
             </w:r>
           </w:p>
         </w:tc>
@@ -2658,7 +2658,7 @@
               <w:rPr>
                 <w:sz w:val="18"/>
               </w:rPr>
-              <w:t>0.00825</w:t>
+              <w:t>0.00803</w:t>
             </w:r>
           </w:p>
         </w:tc>
@@ -2686,7 +2686,7 @@
               <w:rPr>
                 <w:sz w:val="18"/>
               </w:rPr>
-              <w:t>0.00071</w:t>
+              <w:t>0.00049</w:t>
             </w:r>
           </w:p>
         </w:tc>
@@ -2714,7 +2714,7 @@
               <w:rPr>
                 <w:sz w:val="18"/>
               </w:rPr>
-              <w:t>9.1</w:t>
+              <w:t>9.0</w:t>
             </w:r>
           </w:p>
         </w:tc>
@@ -2728,7 +2728,7 @@
               <w:rPr>
                 <w:sz w:val="18"/>
               </w:rPr>
-              <w:t>2.7</w:t>
+              <w:t>2.2</w:t>
             </w:r>
           </w:p>
         </w:tc>
@@ -2758,7 +2758,7 @@
               <w:rPr>
                 <w:sz w:val="18"/>
               </w:rPr>
-              <w:t>+0.003</w:t>
+              <w:t>+0.002</w:t>
             </w:r>
           </w:p>
         </w:tc>
@@ -2772,7 +2772,7 @@
               <w:rPr>
                 <w:sz w:val="18"/>
               </w:rPr>
-              <w:t>0.00407</w:t>
+              <w:t>0.00392</w:t>
             </w:r>
           </w:p>
         </w:tc>
@@ -2786,7 +2786,7 @@
               <w:rPr>
                 <w:sz w:val="18"/>
               </w:rPr>
-              <w:t>0.00425</w:t>
+              <w:t>0.00408</w:t>
             </w:r>
           </w:p>
         </w:tc>
@@ -2814,7 +2814,7 @@
               <w:rPr>
                 <w:sz w:val="18"/>
               </w:rPr>
-              <w:t>0.00222</w:t>
+              <w:t>0.00206</w:t>
             </w:r>
           </w:p>
         </w:tc>
@@ -2828,6 +2828,20 @@
               <w:rPr>
                 <w:sz w:val="18"/>
               </w:rPr>
+              <w:t>6.3</w:t>
+            </w:r>
+          </w:p>
+        </w:tc>
+        <w:tc>
+          <w:tcPr>
+            <w:tcW w:type="dxa" w:w="960"/>
+          </w:tcPr>
+          <w:p>
+            <w:r/>
+            <w:r>
+              <w:rPr>
+                <w:sz w:val="18"/>
+              </w:rPr>
               <w:t>6.4</w:t>
             </w:r>
           </w:p>
@@ -2842,21 +2856,7 @@
               <w:rPr>
                 <w:sz w:val="18"/>
               </w:rPr>
-              <w:t>6.5</w:t>
-            </w:r>
-          </w:p>
-        </w:tc>
-        <w:tc>
-          <w:tcPr>
-            <w:tcW w:type="dxa" w:w="960"/>
-          </w:tcPr>
-          <w:p>
-            <w:r/>
-            <w:r>
-              <w:rPr>
-                <w:sz w:val="18"/>
-              </w:rPr>
-              <w:t>4.7</w:t>
+              <w:t>4.5</w:t>
             </w:r>
           </w:p>
         </w:tc>
@@ -2886,7 +2886,7 @@
               <w:rPr>
                 <w:sz w:val="18"/>
               </w:rPr>
-              <w:t>+0.009</w:t>
+              <w:t>+0.008</w:t>
             </w:r>
           </w:p>
         </w:tc>
@@ -2900,7 +2900,7 @@
               <w:rPr>
                 <w:sz w:val="18"/>
               </w:rPr>
-              <w:t>0.00395</w:t>
+              <w:t>0.00380</w:t>
             </w:r>
           </w:p>
         </w:tc>
@@ -2914,7 +2914,7 @@
               <w:rPr>
                 <w:sz w:val="18"/>
               </w:rPr>
-              <w:t>0.00409</w:t>
+              <w:t>0.00392</w:t>
             </w:r>
           </w:p>
         </w:tc>
@@ -2942,7 +2942,7 @@
               <w:rPr>
                 <w:sz w:val="18"/>
               </w:rPr>
-              <w:t>0.00117</w:t>
+              <w:t>0.00101</w:t>
             </w:r>
           </w:p>
         </w:tc>
@@ -2956,6 +2956,20 @@
               <w:rPr>
                 <w:sz w:val="18"/>
               </w:rPr>
+              <w:t>6.2</w:t>
+            </w:r>
+          </w:p>
+        </w:tc>
+        <w:tc>
+          <w:tcPr>
+            <w:tcW w:type="dxa" w:w="960"/>
+          </w:tcPr>
+          <w:p>
+            <w:r/>
+            <w:r>
+              <w:rPr>
+                <w:sz w:val="18"/>
+              </w:rPr>
               <w:t>6.3</w:t>
             </w:r>
           </w:p>
@@ -2970,21 +2984,7 @@
               <w:rPr>
                 <w:sz w:val="18"/>
               </w:rPr>
-              <w:t>6.4</w:t>
-            </w:r>
-          </w:p>
-        </w:tc>
-        <w:tc>
-          <w:tcPr>
-            <w:tcW w:type="dxa" w:w="960"/>
-          </w:tcPr>
-          <w:p>
-            <w:r/>
-            <w:r>
-              <w:rPr>
-                <w:sz w:val="18"/>
-              </w:rPr>
-              <w:t>3.4</w:t>
+              <w:t>3.2</w:t>
             </w:r>
           </w:p>
         </w:tc>
@@ -3014,7 +3014,7 @@
               <w:rPr>
                 <w:sz w:val="18"/>
               </w:rPr>
-              <w:t>-0.289</w:t>
+              <w:t>-0.282</w:t>
             </w:r>
           </w:p>
         </w:tc>
@@ -3028,7 +3028,7 @@
               <w:rPr>
                 <w:sz w:val="18"/>
               </w:rPr>
-              <w:t>0.07440</w:t>
+              <w:t>0.07169</w:t>
             </w:r>
           </w:p>
         </w:tc>
@@ -3042,7 +3042,7 @@
               <w:rPr>
                 <w:sz w:val="18"/>
               </w:rPr>
-              <w:t>0.03396</w:t>
+              <w:t>0.03316</w:t>
             </w:r>
           </w:p>
         </w:tc>
@@ -3070,7 +3070,7 @@
               <w:rPr>
                 <w:sz w:val="18"/>
               </w:rPr>
-              <w:t>0.01563</w:t>
+              <w:t>0.01483</w:t>
             </w:r>
           </w:p>
         </w:tc>
@@ -3084,7 +3084,7 @@
               <w:rPr>
                 <w:sz w:val="18"/>
               </w:rPr>
-              <w:t>27.8</w:t>
+              <w:t>27.3</w:t>
             </w:r>
           </w:p>
         </w:tc>
@@ -3098,7 +3098,7 @@
               <w:rPr>
                 <w:sz w:val="18"/>
               </w:rPr>
-              <w:t>18.6</w:t>
+              <w:t>18.4</w:t>
             </w:r>
           </w:p>
         </w:tc>
@@ -3112,7 +3112,7 @@
               <w:rPr>
                 <w:sz w:val="18"/>
               </w:rPr>
-              <w:t>12.6</w:t>
+              <w:t>12.2</w:t>
             </w:r>
           </w:p>
         </w:tc>
@@ -3142,7 +3142,7 @@
               <w:rPr>
                 <w:sz w:val="18"/>
               </w:rPr>
-              <w:t>-0.228</w:t>
+              <w:t>-0.224</w:t>
             </w:r>
           </w:p>
         </w:tc>
@@ -3156,7 +3156,7 @@
               <w:rPr>
                 <w:sz w:val="18"/>
               </w:rPr>
-              <w:t>0.05046</w:t>
+              <w:t>0.04874</w:t>
             </w:r>
           </w:p>
         </w:tc>
@@ -3170,7 +3170,7 @@
               <w:rPr>
                 <w:sz w:val="18"/>
               </w:rPr>
-              <w:t>0.02551</w:t>
+              <w:t>0.02467</w:t>
             </w:r>
           </w:p>
         </w:tc>
@@ -3198,7 +3198,7 @@
               <w:rPr>
                 <w:sz w:val="18"/>
               </w:rPr>
-              <w:t>0.00824</w:t>
+              <w:t>0.00740</w:t>
             </w:r>
           </w:p>
         </w:tc>
@@ -3212,7 +3212,7 @@
               <w:rPr>
                 <w:sz w:val="18"/>
               </w:rPr>
-              <w:t>22.7</w:t>
+              <w:t>22.3</w:t>
             </w:r>
           </w:p>
         </w:tc>
@@ -3226,7 +3226,7 @@
               <w:rPr>
                 <w:sz w:val="18"/>
               </w:rPr>
-              <w:t>16.1</w:t>
+              <w:t>15.8</w:t>
             </w:r>
           </w:p>
         </w:tc>
@@ -3240,7 +3240,7 @@
               <w:rPr>
                 <w:sz w:val="18"/>
               </w:rPr>
-              <w:t>9.1</w:t>
+              <w:t>8.6</w:t>
             </w:r>
           </w:p>
         </w:tc>
@@ -3399,7 +3399,7 @@
               <w:rPr>
                 <w:sz w:val="18"/>
               </w:rPr>
-              <w:t>10.4 P</w:t>
+              <w:t>10.2 P</w:t>
             </w:r>
           </w:p>
         </w:tc>
@@ -3457,7 +3457,7 @@
               <w:rPr>
                 <w:sz w:val="18"/>
               </w:rPr>
-              <w:t>13.3 P</w:t>
+              <w:t>13.0 P</w:t>
             </w:r>
           </w:p>
         </w:tc>
@@ -3515,7 +3515,7 @@
               <w:rPr>
                 <w:sz w:val="18"/>
               </w:rPr>
-              <w:t>9.1 P</w:t>
+              <w:t>9.0 P</w:t>
             </w:r>
           </w:p>
         </w:tc>
@@ -3573,7 +3573,7 @@
               <w:rPr>
                 <w:sz w:val="18"/>
               </w:rPr>
-              <w:t>6.5 P</w:t>
+              <w:t>6.4 P</w:t>
             </w:r>
           </w:p>
         </w:tc>
@@ -3631,7 +3631,7 @@
               <w:rPr>
                 <w:sz w:val="18"/>
               </w:rPr>
-              <w:t>6.4 P</w:t>
+              <w:t>6.3 P</w:t>
             </w:r>
           </w:p>
         </w:tc>
@@ -3689,7 +3689,7 @@
               <w:rPr>
                 <w:sz w:val="18"/>
               </w:rPr>
-              <w:t>18.6 P</w:t>
+              <w:t>18.4 P</w:t>
             </w:r>
           </w:p>
         </w:tc>
@@ -3747,7 +3747,7 @@
               <w:rPr>
                 <w:sz w:val="18"/>
               </w:rPr>
-              <w:t>16.1 P</w:t>
+              <w:t>15.8 P</w:t>
             </w:r>
           </w:p>
         </w:tc>
@@ -3889,7 +3889,7 @@
               <w:rPr>
                 <w:sz w:val="18"/>
               </w:rPr>
-              <w:t>23.7 P</w:t>
+              <w:t>24.1 P</w:t>
             </w:r>
           </w:p>
         </w:tc>
@@ -3947,7 +3947,7 @@
               <w:rPr>
                 <w:sz w:val="18"/>
               </w:rPr>
-              <w:t>95.1 P</w:t>
+              <w:t>95.7 P</w:t>
             </w:r>
           </w:p>
         </w:tc>
@@ -4005,7 +4005,7 @@
               <w:rPr>
                 <w:sz w:val="18"/>
               </w:rPr>
-              <w:t>45.1 P</w:t>
+              <w:t>45.7 P</w:t>
             </w:r>
           </w:p>
         </w:tc>
@@ -4063,7 +4063,7 @@
               <w:rPr>
                 <w:sz w:val="18"/>
               </w:rPr>
-              <w:t>35.3 P</w:t>
+              <w:t>35.8 P</w:t>
             </w:r>
           </w:p>
         </w:tc>
@@ -4213,7 +4213,7 @@
               <w:rPr>
                 <w:sz w:val="18"/>
               </w:rPr>
-              <w:t>7.2 P/P</w:t>
+              <w:t>6.9 P/P</w:t>
             </w:r>
           </w:p>
         </w:tc>
@@ -4271,7 +4271,7 @@
               <w:rPr>
                 <w:sz w:val="18"/>
               </w:rPr>
-              <w:t>2.2 P/P</w:t>
+              <w:t>0.0 P/P</w:t>
             </w:r>
           </w:p>
         </w:tc>
@@ -4329,7 +4329,7 @@
               <w:rPr>
                 <w:sz w:val="18"/>
               </w:rPr>
-              <w:t>2.7 P/P</w:t>
+              <w:t>2.2 P/P</w:t>
             </w:r>
           </w:p>
         </w:tc>
@@ -4387,7 +4387,7 @@
               <w:rPr>
                 <w:sz w:val="18"/>
               </w:rPr>
-              <w:t>4.7 F/P</w:t>
+              <w:t>4.5 F/P</w:t>
             </w:r>
           </w:p>
         </w:tc>
@@ -4445,7 +4445,7 @@
               <w:rPr>
                 <w:sz w:val="18"/>
               </w:rPr>
-              <w:t>3.4 P/P</w:t>
+              <w:t>3.2 P/P</w:t>
             </w:r>
           </w:p>
         </w:tc>
@@ -4503,7 +4503,7 @@
               <w:rPr>
                 <w:sz w:val="18"/>
               </w:rPr>
-              <w:t>12.6 P/F</w:t>
+              <w:t>12.2 P/P</w:t>
             </w:r>
           </w:p>
         </w:tc>
@@ -4561,7 +4561,7 @@
               <w:rPr>
                 <w:sz w:val="18"/>
               </w:rPr>
-              <w:t>9.1 P/P</w:t>
+              <w:t>8.6 P/P</w:t>
             </w:r>
           </w:p>
         </w:tc>
@@ -5159,7 +5159,7 @@
               <w:rPr>
                 <w:sz w:val="18"/>
               </w:rPr>
-              <w:t>+0.2 [-9.4,+9.4]</w:t>
+              <w:t>+0.0 [-8.6,+9.3]</w:t>
             </w:r>
           </w:p>
         </w:tc>
@@ -5203,7 +5203,7 @@
               <w:rPr>
                 <w:sz w:val="18"/>
               </w:rPr>
-              <w:t>-1.4 [-11.1,+7.1]</w:t>
+              <w:t>-1.4 [-10.6,+7.0]</w:t>
             </w:r>
           </w:p>
         </w:tc>
@@ -5247,7 +5247,7 @@
               <w:rPr>
                 <w:sz w:val="18"/>
               </w:rPr>
-              <w:t>-114.8 [-161.9,-71.6]</w:t>
+              <w:t>-111.2 [-158.1,-69.3]</w:t>
             </w:r>
           </w:p>
         </w:tc>
@@ -5291,7 +5291,7 @@
               <w:rPr>
                 <w:sz w:val="18"/>
               </w:rPr>
-              <w:t>-114.6 [-168.0,-66.7]</w:t>
+              <w:t>-111.1 [-159.1,-64.2]</w:t>
             </w:r>
           </w:p>
         </w:tc>

</xml_diff>

<commit_message>
Finalize stat methods docx at complete dataset N=25
Regenerated with corrected §9/§10 caveats (N=24 -> N=25; PT-136 recovery instead of
exclusion). Data tables and caveat text now all reflect the complete N=25 sub-segment
cohort. Verified zero stale N=24 references. (.pptx regenerated too; git-ignored.)

Co-Authored-By: Claude Opus 4.8 (1M context) <noreply@anthropic.com>
</commit_message>
<xml_diff>
--- a/PCCT_Statistical_Methods_and_Results.docx
+++ b/PCCT_Statistical_Methods_and_Results.docx
@@ -5604,7 +5604,7 @@
         <w:pStyle w:val="ListBullet"/>
       </w:pPr>
       <w:r>
-        <w:t>Scanner-attributable variance (Var(d)/2 − σ²_OQ) is ≤ the OQ limit / CI-includes-0 for most endpoints on the canonical region, and on the extent-controlled sub-segment region (regenerated on v2, N=24) it is ≤ OQ / CI-includes-0 for nearly all endpoints — i.e. after removing reader+repeat (OQ) and traced extent (sub-segment), the residual scanner-attributable variability is within the OQ envelope.</w:t>
+        <w:t>Scanner-attributable variance (Var(d)/2 − σ²_OQ) is ≤ the OQ limit / CI-includes-0 for most endpoints on the canonical region, and on the extent-controlled sub-segment region (regenerated on v2, N=25) it is ≤ OQ / CI-includes-0 for nearly all endpoints — i.e. after removing reader+repeat (OQ) and traced extent (sub-segment), the residual scanner-attributable variability is within the OQ envelope.</w:t>
       </w:r>
     </w:p>
     <w:p>
@@ -5620,7 +5620,7 @@
         <w:pStyle w:val="ListBullet"/>
       </w:pPr>
       <w:r>
-        <w:t>N = 25 canonical / 24 sub-segment, preliminary (target ≥ 30); passes are CI-overlap-driven with wide CIs.</w:t>
+        <w:t>N = 25 canonical / 25 sub-segment, preliminary (target ≥ 30); passes are CI-overlap-driven with wide CIs.</w:t>
       </w:r>
     </w:p>
     <w:p>
@@ -5628,7 +5628,7 @@
         <w:pStyle w:val="ListBullet"/>
       </w:pPr>
       <w:r>
-        <w:t>Canonical region retains a traced-extent differential (PCCT traces ~+26% longer within shared vessels; Gate 2 REVIEW). The sub-segment (distance-from-ostium) intersection removes it; regenerated on v2 (2026-07-07) data, N=24 (PT-124 no vessel overlap, PT-136 duplicate LeftCoronary in workitem.json — both excluded). Pipeline: scripts/subsegment/.</w:t>
+        <w:t>Canonical region retains a traced-extent differential (PCCT traces ~+26% longer within shared vessels; Gate 2 REVIEW). The sub-segment (distance-from-ostium) intersection removes it; regenerated on v2 (2026-07-07) data, N=25 (PT-124 excluded — no PCCT∩EID vessel overlap; PT-136 recovered as two left targets, LAD+Diagonal and Circumflex+Marginal). Pipeline: scripts/subsegment/.</w:t>
       </w:r>
     </w:p>
     <w:p>

</xml_diff>

<commit_message>
Gate 4 OQ comparison: use sub-segment length-normalized bias (fix canonical extent confound)
The OQ untransformed BA bias is length-normalized from within-scan reader-repeat (no extent
differential). Canonical per-mm normalization was confounded: PCCT traces ~+19% longer than
EID, so dividing by the larger PCCT length spuriously depressed every PCCT per-mm value
(e.g. CALC raw Δ≈0 but canonical per-mm -0.095). Switched the OQ comparison to the
EXTENT-MATCHED sub-segment length-normalized bias across stat doc §8a, HTML gate4 table,
and the OQ-overlay plots; canonical/sub-seg RAW mm³ shown as reference.

Now consistent with the Bland-Altmans: v2 CALC +0.006 (overlap), LRNC +0.007 (overlap),
NonCALC -0.584 / Total -0.578 (no overlap, real modality bias). Also surfaces v1 CALC
over-read (+0.160, fails) that the 07-07 re-work resolved.

Co-Authored-By: Claude Opus 4.8 (1M context) <noreply@anthropic.com>
</commit_message>
<xml_diff>
--- a/PCCT_Statistical_Methods_and_Results.docx
+++ b/PCCT_Statistical_Methods_and_Results.docx
@@ -3252,7 +3252,7 @@
           <w:b w:val="0"/>
           <w:i/>
         </w:rPr>
-        <w:t>Results are on the sub-segment (extent-matched) region for v1 and v2. σ²_random / σ²_scanner are small (the extent term is removed by the sub-segment intersection) and stable v1→v2 — the 07-07 re-work changed the systematic bias (Gate 4), not the random reproducibility (Gate 3). Gate 4 bias (§8) is assessed on the canonical length-normalized scale to match the OQ.</w:t>
+        <w:t>Results are on the sub-segment (extent-matched) region for v1 and v2. σ²_random / σ²_scanner are small (the extent term is removed by the sub-segment intersection) and stable v1→v2 — the 07-07 re-work changed the systematic bias (Gate 4), not the random reproducibility (Gate 3). Gate 4 bias (§8) is assessed on the extent-matched sub-segment length-normalized scale (the OQ-comparable basis; canonical per-mm is confounded by the PCCT extent differential).</w:t>
       </w:r>
     </w:p>
     <w:p>
@@ -4590,7 +4590,7 @@
           <w:b/>
           <w:i w:val="0"/>
         </w:rPr>
-        <w:t>The OQ Bland-Altman bias reference (730-CVV-040 ATTACHMENT 2, "Untransformed analysis") is UNTRANSFORMED and LENGTH-NORMALIZED. So the like-for-like PCCT comparison uses the canonical length-normalized bias; length-normalization is not meaningful on the sub-segment (extent is already matched), so the sub-segment bias is shown as a raw-mm³ reference column. The OQ tabulates only the untransformed BA bias (transformed is plots-only), so no transformed-bias comparison is possible. Plaque endpoints.</w:t>
+        <w:t>The OQ Bland-Altman bias reference (730-CVV-040 ATTACHMENT 2, "Untransformed analysis") is UNTRANSFORMED and LENGTH-NORMALIZED (per-mm), from within-scan reader-repeat — i.e. with NO extent differential. The like-for-like PCCT comparison must therefore also be extent-matched: the SUB-SEGMENT length-normalized bias. Canonical length-normalization is NOT used for the OQ comparison because PCCT traces ~+19% longer than EID on the full vessel, so dividing by the larger PCCT length spuriously depresses every PCCT per-mm value (e.g. CALC raw Δ ≈ 0 but canonical per-mm −0.095, vs +0.006 on the extent-matched sub-segment). Canonical and sub-segment RAW-mm³ biases are shown as reference. OQ tabulates only the untransformed BA bias, so no transformed comparison is possible. Plaque endpoints.</w:t>
       </w:r>
     </w:p>
     <w:p>
@@ -4599,7 +4599,7 @@
           <w:b/>
           <w:i w:val="0"/>
         </w:rPr>
-        <w:t>8a. Untransformed bias (length-normalized) — OQ 95% CI vs PCCT canonical; overlap P/F.</w:t>
+        <w:t>8a. OQ comparison — sub-segment (extent-matched) length-normalized bias, per-mm. OQ 95% CI vs PCCT v1/v2; overlap P/F.</w:t>
       </w:r>
     </w:p>
     <w:tbl>
@@ -4658,7 +4658,7 @@
                 <w:b/>
                 <w:sz w:val="18"/>
               </w:rPr>
-              <w:t>v1 canonical bias [95% CI]</w:t>
+              <w:t>v1 sub-seg bias [95% CI]</w:t>
             </w:r>
           </w:p>
         </w:tc>
@@ -4688,7 +4688,7 @@
                 <w:b/>
                 <w:sz w:val="18"/>
               </w:rPr>
-              <w:t>v2 canonical bias [95% CI]</w:t>
+              <w:t>v2 sub-seg bias [95% CI]</w:t>
             </w:r>
           </w:p>
         </w:tc>
@@ -4747,7 +4747,7 @@
               <w:rPr>
                 <w:sz w:val="18"/>
               </w:rPr>
-              <w:t>+0.017 [-0.075,+0.114]</w:t>
+              <w:t>+0.160 [+0.092,+0.238]</w:t>
             </w:r>
           </w:p>
         </w:tc>
@@ -4761,7 +4761,7 @@
               <w:rPr>
                 <w:sz w:val="18"/>
               </w:rPr>
-              <w:t>P</w:t>
+              <w:t>F</w:t>
             </w:r>
           </w:p>
         </w:tc>
@@ -4775,7 +4775,7 @@
               <w:rPr>
                 <w:sz w:val="18"/>
               </w:rPr>
-              <w:t>-0.095 [-0.192,-0.004]</w:t>
+              <w:t>+0.006 [-0.064,+0.071]</w:t>
             </w:r>
           </w:p>
         </w:tc>
@@ -4833,7 +4833,7 @@
               <w:rPr>
                 <w:sz w:val="18"/>
               </w:rPr>
-              <w:t>+0.037 [-0.021,+0.122]</w:t>
+              <w:t>+0.052 [-0.002,+0.134]</w:t>
             </w:r>
           </w:p>
         </w:tc>
@@ -4847,7 +4847,7 @@
               <w:rPr>
                 <w:sz w:val="18"/>
               </w:rPr>
-              <w:t>P</w:t>
+              <w:t>F</w:t>
             </w:r>
           </w:p>
         </w:tc>
@@ -4861,7 +4861,7 @@
               <w:rPr>
                 <w:sz w:val="18"/>
               </w:rPr>
-              <w:t>-0.009 [-0.052,+0.043]</w:t>
+              <w:t>+0.007 [-0.032,+0.056]</w:t>
             </w:r>
           </w:p>
         </w:tc>
@@ -4919,7 +4919,7 @@
               <w:rPr>
                 <w:sz w:val="18"/>
               </w:rPr>
-              <w:t>-0.427 [-0.689,-0.189]</w:t>
+              <w:t>-0.404 [-0.663,-0.159]</w:t>
             </w:r>
           </w:p>
         </w:tc>
@@ -4947,7 +4947,7 @@
               <w:rPr>
                 <w:sz w:val="18"/>
               </w:rPr>
-              <w:t>-0.626 [-0.876,-0.398]</w:t>
+              <w:t>-0.584 [-0.849,-0.341]</w:t>
             </w:r>
           </w:p>
         </w:tc>
@@ -5005,7 +5005,7 @@
               <w:rPr>
                 <w:sz w:val="18"/>
               </w:rPr>
-              <w:t>-0.373 [-0.749,-0.018]</w:t>
+              <w:t>-0.192 [-0.489,+0.106]</w:t>
             </w:r>
           </w:p>
         </w:tc>
@@ -5033,7 +5033,7 @@
               <w:rPr>
                 <w:sz w:val="18"/>
               </w:rPr>
-              <w:t>-0.730 [-1.106,-0.398]</w:t>
+              <w:t>-0.578 [-0.878,-0.298]</w:t>
             </w:r>
           </w:p>
         </w:tc>
@@ -5059,7 +5059,7 @@
           <w:b/>
           <w:i w:val="0"/>
         </w:rPr>
-        <w:t>8b. Sub-segment bias (raw mm³, extent-matched — length-norm not applicable), shown for reference alongside the canonical/OQ comparison above.</w:t>
+        <w:t>8b. Raw-mm³ bias reference (actual volume differences; not length-normalized). Canonical retains the extent differential; sub-segment is extent-matched.</w:t>
       </w:r>
     </w:p>
     <w:tbl>
@@ -5069,14 +5069,16 @@
         <w:tblLook w:firstColumn="1" w:firstRow="1" w:lastColumn="0" w:lastRow="0" w:noHBand="0" w:noVBand="1" w:val="04A0"/>
       </w:tblPr>
       <w:tblGrid>
-        <w:gridCol w:w="2880"/>
-        <w:gridCol w:w="2880"/>
-        <w:gridCol w:w="2880"/>
+        <w:gridCol w:w="1728"/>
+        <w:gridCol w:w="1728"/>
+        <w:gridCol w:w="1728"/>
+        <w:gridCol w:w="1728"/>
+        <w:gridCol w:w="1728"/>
       </w:tblGrid>
       <w:tr>
         <w:tc>
           <w:tcPr>
-            <w:tcW w:type="dxa" w:w="2880"/>
+            <w:tcW w:type="dxa" w:w="1728"/>
           </w:tcPr>
           <w:p>
             <w:r/>
@@ -5091,7 +5093,7 @@
         </w:tc>
         <w:tc>
           <w:tcPr>
-            <w:tcW w:type="dxa" w:w="2880"/>
+            <w:tcW w:type="dxa" w:w="1728"/>
           </w:tcPr>
           <w:p>
             <w:r/>
@@ -5100,13 +5102,13 @@
                 <w:b/>
                 <w:sz w:val="18"/>
               </w:rPr>
-              <w:t>v1 sub-seg bias (mm³) [95% CI]</w:t>
-            </w:r>
-          </w:p>
-        </w:tc>
-        <w:tc>
-          <w:tcPr>
-            <w:tcW w:type="dxa" w:w="2880"/>
+              <w:t>v1 canon (mm³)</w:t>
+            </w:r>
+          </w:p>
+        </w:tc>
+        <w:tc>
+          <w:tcPr>
+            <w:tcW w:type="dxa" w:w="1728"/>
           </w:tcPr>
           <w:p>
             <w:r/>
@@ -5115,7 +5117,37 @@
                 <w:b/>
                 <w:sz w:val="18"/>
               </w:rPr>
-              <w:t>v2 sub-seg bias (mm³) [95% CI]</w:t>
+              <w:t>v2 canon (mm³)</w:t>
+            </w:r>
+          </w:p>
+        </w:tc>
+        <w:tc>
+          <w:tcPr>
+            <w:tcW w:type="dxa" w:w="1728"/>
+          </w:tcPr>
+          <w:p>
+            <w:r/>
+            <w:r>
+              <w:rPr>
+                <w:b/>
+                <w:sz w:val="18"/>
+              </w:rPr>
+              <w:t>v1 sub-seg (mm³)</w:t>
+            </w:r>
+          </w:p>
+        </w:tc>
+        <w:tc>
+          <w:tcPr>
+            <w:tcW w:type="dxa" w:w="1728"/>
+          </w:tcPr>
+          <w:p>
+            <w:r/>
+            <w:r>
+              <w:rPr>
+                <w:b/>
+                <w:sz w:val="18"/>
+              </w:rPr>
+              <w:t>v2 sub-seg (mm³)</w:t>
             </w:r>
           </w:p>
         </w:tc>
@@ -5123,7 +5155,7 @@
       <w:tr>
         <w:tc>
           <w:tcPr>
-            <w:tcW w:type="dxa" w:w="2880"/>
+            <w:tcW w:type="dxa" w:w="1728"/>
           </w:tcPr>
           <w:p>
             <w:r/>
@@ -5137,29 +5169,57 @@
         </w:tc>
         <w:tc>
           <w:tcPr>
-            <w:tcW w:type="dxa" w:w="2880"/>
-          </w:tcPr>
-          <w:p>
-            <w:r/>
-            <w:r>
-              <w:rPr>
-                <w:sz w:val="18"/>
-              </w:rPr>
-              <w:t>+24.9 [+14.5,+37.4]</w:t>
-            </w:r>
-          </w:p>
-        </w:tc>
-        <w:tc>
-          <w:tcPr>
-            <w:tcW w:type="dxa" w:w="2880"/>
-          </w:tcPr>
-          <w:p>
-            <w:r/>
-            <w:r>
-              <w:rPr>
-                <w:sz w:val="18"/>
-              </w:rPr>
-              <w:t>+0.0 [-8.6,+9.3]</w:t>
+            <w:tcW w:type="dxa" w:w="1728"/>
+          </w:tcPr>
+          <w:p>
+            <w:r/>
+            <w:r>
+              <w:rPr>
+                <w:sz w:val="18"/>
+              </w:rPr>
+              <w:t>+27.7</w:t>
+            </w:r>
+          </w:p>
+        </w:tc>
+        <w:tc>
+          <w:tcPr>
+            <w:tcW w:type="dxa" w:w="1728"/>
+          </w:tcPr>
+          <w:p>
+            <w:r/>
+            <w:r>
+              <w:rPr>
+                <w:sz w:val="18"/>
+              </w:rPr>
+              <w:t>-3.2</w:t>
+            </w:r>
+          </w:p>
+        </w:tc>
+        <w:tc>
+          <w:tcPr>
+            <w:tcW w:type="dxa" w:w="1728"/>
+          </w:tcPr>
+          <w:p>
+            <w:r/>
+            <w:r>
+              <w:rPr>
+                <w:sz w:val="18"/>
+              </w:rPr>
+              <w:t>+24.9</w:t>
+            </w:r>
+          </w:p>
+        </w:tc>
+        <w:tc>
+          <w:tcPr>
+            <w:tcW w:type="dxa" w:w="1728"/>
+          </w:tcPr>
+          <w:p>
+            <w:r/>
+            <w:r>
+              <w:rPr>
+                <w:sz w:val="18"/>
+              </w:rPr>
+              <w:t>+0.0</w:t>
             </w:r>
           </w:p>
         </w:tc>
@@ -5167,7 +5227,7 @@
       <w:tr>
         <w:tc>
           <w:tcPr>
-            <w:tcW w:type="dxa" w:w="2880"/>
+            <w:tcW w:type="dxa" w:w="1728"/>
           </w:tcPr>
           <w:p>
             <w:r/>
@@ -5181,29 +5241,57 @@
         </w:tc>
         <w:tc>
           <w:tcPr>
-            <w:tcW w:type="dxa" w:w="2880"/>
-          </w:tcPr>
-          <w:p>
-            <w:r/>
-            <w:r>
-              <w:rPr>
-                <w:sz w:val="18"/>
-              </w:rPr>
-              <w:t>+6.5 [-1.4,+16.8]</w:t>
-            </w:r>
-          </w:p>
-        </w:tc>
-        <w:tc>
-          <w:tcPr>
-            <w:tcW w:type="dxa" w:w="2880"/>
-          </w:tcPr>
-          <w:p>
-            <w:r/>
-            <w:r>
-              <w:rPr>
-                <w:sz w:val="18"/>
-              </w:rPr>
-              <w:t>-1.4 [-10.6,+7.0]</w:t>
+            <w:tcW w:type="dxa" w:w="1728"/>
+          </w:tcPr>
+          <w:p>
+            <w:r/>
+            <w:r>
+              <w:rPr>
+                <w:sz w:val="18"/>
+              </w:rPr>
+              <w:t>+5.6</w:t>
+            </w:r>
+          </w:p>
+        </w:tc>
+        <w:tc>
+          <w:tcPr>
+            <w:tcW w:type="dxa" w:w="1728"/>
+          </w:tcPr>
+          <w:p>
+            <w:r/>
+            <w:r>
+              <w:rPr>
+                <w:sz w:val="18"/>
+              </w:rPr>
+              <w:t>-4.2</w:t>
+            </w:r>
+          </w:p>
+        </w:tc>
+        <w:tc>
+          <w:tcPr>
+            <w:tcW w:type="dxa" w:w="1728"/>
+          </w:tcPr>
+          <w:p>
+            <w:r/>
+            <w:r>
+              <w:rPr>
+                <w:sz w:val="18"/>
+              </w:rPr>
+              <w:t>+6.5</w:t>
+            </w:r>
+          </w:p>
+        </w:tc>
+        <w:tc>
+          <w:tcPr>
+            <w:tcW w:type="dxa" w:w="1728"/>
+          </w:tcPr>
+          <w:p>
+            <w:r/>
+            <w:r>
+              <w:rPr>
+                <w:sz w:val="18"/>
+              </w:rPr>
+              <w:t>-1.4</w:t>
             </w:r>
           </w:p>
         </w:tc>
@@ -5211,7 +5299,7 @@
       <w:tr>
         <w:tc>
           <w:tcPr>
-            <w:tcW w:type="dxa" w:w="2880"/>
+            <w:tcW w:type="dxa" w:w="1728"/>
           </w:tcPr>
           <w:p>
             <w:r/>
@@ -5225,29 +5313,57 @@
         </w:tc>
         <w:tc>
           <w:tcPr>
-            <w:tcW w:type="dxa" w:w="2880"/>
-          </w:tcPr>
-          <w:p>
-            <w:r/>
-            <w:r>
-              <w:rPr>
-                <w:sz w:val="18"/>
-              </w:rPr>
-              <w:t>-76.6 [-121.4,-33.6]</w:t>
-            </w:r>
-          </w:p>
-        </w:tc>
-        <w:tc>
-          <w:tcPr>
-            <w:tcW w:type="dxa" w:w="2880"/>
-          </w:tcPr>
-          <w:p>
-            <w:r/>
-            <w:r>
-              <w:rPr>
-                <w:sz w:val="18"/>
-              </w:rPr>
-              <w:t>-111.2 [-158.1,-69.3]</w:t>
+            <w:tcW w:type="dxa" w:w="1728"/>
+          </w:tcPr>
+          <w:p>
+            <w:r/>
+            <w:r>
+              <w:rPr>
+                <w:sz w:val="18"/>
+              </w:rPr>
+              <w:t>-65.2</w:t>
+            </w:r>
+          </w:p>
+        </w:tc>
+        <w:tc>
+          <w:tcPr>
+            <w:tcW w:type="dxa" w:w="1728"/>
+          </w:tcPr>
+          <w:p>
+            <w:r/>
+            <w:r>
+              <w:rPr>
+                <w:sz w:val="18"/>
+              </w:rPr>
+              <w:t>-108.9</w:t>
+            </w:r>
+          </w:p>
+        </w:tc>
+        <w:tc>
+          <w:tcPr>
+            <w:tcW w:type="dxa" w:w="1728"/>
+          </w:tcPr>
+          <w:p>
+            <w:r/>
+            <w:r>
+              <w:rPr>
+                <w:sz w:val="18"/>
+              </w:rPr>
+              <w:t>-76.6</w:t>
+            </w:r>
+          </w:p>
+        </w:tc>
+        <w:tc>
+          <w:tcPr>
+            <w:tcW w:type="dxa" w:w="1728"/>
+          </w:tcPr>
+          <w:p>
+            <w:r/>
+            <w:r>
+              <w:rPr>
+                <w:sz w:val="18"/>
+              </w:rPr>
+              <w:t>-111.2</w:t>
             </w:r>
           </w:p>
         </w:tc>
@@ -5255,7 +5371,7 @@
       <w:tr>
         <w:tc>
           <w:tcPr>
-            <w:tcW w:type="dxa" w:w="2880"/>
+            <w:tcW w:type="dxa" w:w="1728"/>
           </w:tcPr>
           <w:p>
             <w:r/>
@@ -5269,29 +5385,57 @@
         </w:tc>
         <w:tc>
           <w:tcPr>
-            <w:tcW w:type="dxa" w:w="2880"/>
-          </w:tcPr>
-          <w:p>
-            <w:r/>
-            <w:r>
-              <w:rPr>
-                <w:sz w:val="18"/>
-              </w:rPr>
-              <w:t>-45.2 [-94.7,+5.4]</w:t>
-            </w:r>
-          </w:p>
-        </w:tc>
-        <w:tc>
-          <w:tcPr>
-            <w:tcW w:type="dxa" w:w="2880"/>
-          </w:tcPr>
-          <w:p>
-            <w:r/>
-            <w:r>
-              <w:rPr>
-                <w:sz w:val="18"/>
-              </w:rPr>
-              <w:t>-111.1 [-159.1,-64.2]</w:t>
+            <w:tcW w:type="dxa" w:w="1728"/>
+          </w:tcPr>
+          <w:p>
+            <w:r/>
+            <w:r>
+              <w:rPr>
+                <w:sz w:val="18"/>
+              </w:rPr>
+              <w:t>-31.9</w:t>
+            </w:r>
+          </w:p>
+        </w:tc>
+        <w:tc>
+          <w:tcPr>
+            <w:tcW w:type="dxa" w:w="1728"/>
+          </w:tcPr>
+          <w:p>
+            <w:r/>
+            <w:r>
+              <w:rPr>
+                <w:sz w:val="18"/>
+              </w:rPr>
+              <w:t>-116.2</w:t>
+            </w:r>
+          </w:p>
+        </w:tc>
+        <w:tc>
+          <w:tcPr>
+            <w:tcW w:type="dxa" w:w="1728"/>
+          </w:tcPr>
+          <w:p>
+            <w:r/>
+            <w:r>
+              <w:rPr>
+                <w:sz w:val="18"/>
+              </w:rPr>
+              <w:t>-45.2</w:t>
+            </w:r>
+          </w:p>
+        </w:tc>
+        <w:tc>
+          <w:tcPr>
+            <w:tcW w:type="dxa" w:w="1728"/>
+          </w:tcPr>
+          <w:p>
+            <w:r/>
+            <w:r>
+              <w:rPr>
+                <w:sz w:val="18"/>
+              </w:rPr>
+              <w:t>-111.1</w:t>
             </w:r>
           </w:p>
         </w:tc>
@@ -5303,7 +5447,7 @@
           <w:b w:val="0"/>
           <w:i/>
         </w:rPr>
-        <w:t>Note: canonical bias (length-normalized) is the OQ-comparable quantity; NonCALC Matrix and Total Plaque do not overlap the OQ bias CI (real modality bias). The systematic plaque bias grew v1→v2 (07-07 re-work) and is within the shared centerline, not the traced-extent tail — so it persists on the sub-segment (raw bias column) rather than shrinking.</w:t>
+        <w:t>Note: on the extent-matched sub-segment (the OQ-comparable basis) CALC and LRNC overlap the OQ bias CI (near-zero bias), while NonCALC Matrix and Total Plaque do not — a real modality bias (PCCT lower). The bias grew v1→v2 (07-07 re-work) and persists on the sub-segment (raw column), so it is within the shared centerline, not the traced-extent tail.</w:t>
       </w:r>
     </w:p>
     <w:p>

</xml_diff>

<commit_message>
Revert Gate 4 OQ comparison to CANONICAL length-normalized (apples-to-apples with OQ)
The OQ reference is fixed and length-normalized on the full traced vessel, so the
apples-to-apples PCCT comparator is the canonical (full-vessel) length-normalized bias
(same processing as the OQ), NOT the sub-segment. The CALC per-mm vs raw discrepancy is
just length-normalization carrying each read's traced extent -- which the OQ has too.
Reverted §8a, HTML gate4 table, and OQ-overlay plots to canonical (CALC v2 -0.095 P,
NonCALC/Total no overlap). Kept §8b raw-mm³ reference (canonical + sub-seg) and the
extent-matched sub-segment as a separate composition-vs-extent view.

Co-Authored-By: Claude Opus 4.8 (1M context) <noreply@anthropic.com>
</commit_message>
<xml_diff>
--- a/PCCT_Statistical_Methods_and_Results.docx
+++ b/PCCT_Statistical_Methods_and_Results.docx
@@ -3252,7 +3252,7 @@
           <w:b w:val="0"/>
           <w:i/>
         </w:rPr>
-        <w:t>Results are on the sub-segment (extent-matched) region for v1 and v2. σ²_random / σ²_scanner are small (the extent term is removed by the sub-segment intersection) and stable v1→v2 — the 07-07 re-work changed the systematic bias (Gate 4), not the random reproducibility (Gate 3). Gate 4 bias (§8) is assessed on the extent-matched sub-segment length-normalized scale (the OQ-comparable basis; canonical per-mm is confounded by the PCCT extent differential).</w:t>
+        <w:t>Results are on the sub-segment (extent-matched) region for v1 and v2. σ²_random / σ²_scanner are small (the extent term is removed by the sub-segment intersection) and stable v1→v2 — the 07-07 re-work changed the systematic bias (Gate 4), not the random reproducibility (Gate 3). Gate 4 bias (§8) is assessed on the canonical length-normalized scale — the apples-to-apples match to the length-normalized OQ reference (the sub-segment is a separate extent-controlled view).</w:t>
       </w:r>
     </w:p>
     <w:p>
@@ -4590,7 +4590,7 @@
           <w:b/>
           <w:i w:val="0"/>
         </w:rPr>
-        <w:t>The OQ Bland-Altman bias reference (730-CVV-040 ATTACHMENT 2, "Untransformed analysis") is UNTRANSFORMED and LENGTH-NORMALIZED (per-mm), from within-scan reader-repeat — i.e. with NO extent differential. The like-for-like PCCT comparison must therefore also be extent-matched: the SUB-SEGMENT length-normalized bias. Canonical length-normalization is NOT used for the OQ comparison because PCCT traces ~+19% longer than EID on the full vessel, so dividing by the larger PCCT length spuriously depresses every PCCT per-mm value (e.g. CALC raw Δ ≈ 0 but canonical per-mm −0.095, vs +0.006 on the extent-matched sub-segment). Canonical and sub-segment RAW-mm³ biases are shown as reference. OQ tabulates only the untransformed BA bias, so no transformed comparison is possible. Plaque endpoints.</w:t>
+        <w:t>The OQ Bland-Altman bias reference (730-CVV-040 ATTACHMENT 2, "Untransformed analysis") is a fixed, UNTRANSFORMED and LENGTH-NORMALIZED (per-mm) quantity, computed on the full traced vessel (reader-repeat, each read with its own traced extent). The apples-to-apples PCCT comparison is therefore the CANONICAL (full-vessel) length-normalized bias — the same processing as the OQ. (Length-normalization reflects each read's traced extent exactly as in the OQ; the sub-segment intersection is a different, extent-controlled basis the OQ did not use, so it appears only as a raw-mm³ reference.) OQ tabulates only the untransformed BA bias, so no transformed comparison is possible. Plaque endpoints.</w:t>
       </w:r>
     </w:p>
     <w:p>
@@ -4599,7 +4599,7 @@
           <w:b/>
           <w:i w:val="0"/>
         </w:rPr>
-        <w:t>8a. OQ comparison — sub-segment (extent-matched) length-normalized bias, per-mm. OQ 95% CI vs PCCT v1/v2; overlap P/F.</w:t>
+        <w:t>8a. OQ comparison — canonical (full-vessel) length-normalized bias, per-mm. OQ 95% CI vs PCCT v1/v2; overlap P/F.</w:t>
       </w:r>
     </w:p>
     <w:tbl>
@@ -4658,7 +4658,7 @@
                 <w:b/>
                 <w:sz w:val="18"/>
               </w:rPr>
-              <w:t>v1 sub-seg bias [95% CI]</w:t>
+              <w:t>v1 canonical bias [95% CI]</w:t>
             </w:r>
           </w:p>
         </w:tc>
@@ -4688,7 +4688,7 @@
                 <w:b/>
                 <w:sz w:val="18"/>
               </w:rPr>
-              <w:t>v2 sub-seg bias [95% CI]</w:t>
+              <w:t>v2 canonical bias [95% CI]</w:t>
             </w:r>
           </w:p>
         </w:tc>
@@ -4747,7 +4747,7 @@
               <w:rPr>
                 <w:sz w:val="18"/>
               </w:rPr>
-              <w:t>+0.160 [+0.092,+0.238]</w:t>
+              <w:t>+0.017 [-0.075,+0.114]</w:t>
             </w:r>
           </w:p>
         </w:tc>
@@ -4761,7 +4761,7 @@
               <w:rPr>
                 <w:sz w:val="18"/>
               </w:rPr>
-              <w:t>F</w:t>
+              <w:t>P</w:t>
             </w:r>
           </w:p>
         </w:tc>
@@ -4775,7 +4775,7 @@
               <w:rPr>
                 <w:sz w:val="18"/>
               </w:rPr>
-              <w:t>+0.006 [-0.064,+0.071]</w:t>
+              <w:t>-0.095 [-0.192,-0.004]</w:t>
             </w:r>
           </w:p>
         </w:tc>
@@ -4833,7 +4833,7 @@
               <w:rPr>
                 <w:sz w:val="18"/>
               </w:rPr>
-              <w:t>+0.052 [-0.002,+0.134]</w:t>
+              <w:t>+0.037 [-0.021,+0.122]</w:t>
             </w:r>
           </w:p>
         </w:tc>
@@ -4847,7 +4847,7 @@
               <w:rPr>
                 <w:sz w:val="18"/>
               </w:rPr>
-              <w:t>F</w:t>
+              <w:t>P</w:t>
             </w:r>
           </w:p>
         </w:tc>
@@ -4861,7 +4861,7 @@
               <w:rPr>
                 <w:sz w:val="18"/>
               </w:rPr>
-              <w:t>+0.007 [-0.032,+0.056]</w:t>
+              <w:t>-0.009 [-0.052,+0.043]</w:t>
             </w:r>
           </w:p>
         </w:tc>
@@ -4919,7 +4919,7 @@
               <w:rPr>
                 <w:sz w:val="18"/>
               </w:rPr>
-              <w:t>-0.404 [-0.663,-0.159]</w:t>
+              <w:t>-0.427 [-0.689,-0.189]</w:t>
             </w:r>
           </w:p>
         </w:tc>
@@ -4947,7 +4947,7 @@
               <w:rPr>
                 <w:sz w:val="18"/>
               </w:rPr>
-              <w:t>-0.584 [-0.849,-0.341]</w:t>
+              <w:t>-0.626 [-0.876,-0.398]</w:t>
             </w:r>
           </w:p>
         </w:tc>
@@ -5005,7 +5005,7 @@
               <w:rPr>
                 <w:sz w:val="18"/>
               </w:rPr>
-              <w:t>-0.192 [-0.489,+0.106]</w:t>
+              <w:t>-0.373 [-0.749,-0.018]</w:t>
             </w:r>
           </w:p>
         </w:tc>
@@ -5033,7 +5033,7 @@
               <w:rPr>
                 <w:sz w:val="18"/>
               </w:rPr>
-              <w:t>-0.578 [-0.878,-0.298]</w:t>
+              <w:t>-0.730 [-1.106,-0.398]</w:t>
             </w:r>
           </w:p>
         </w:tc>
@@ -5447,7 +5447,7 @@
           <w:b w:val="0"/>
           <w:i/>
         </w:rPr>
-        <w:t>Note: on the extent-matched sub-segment (the OQ-comparable basis) CALC and LRNC overlap the OQ bias CI (near-zero bias), while NonCALC Matrix and Total Plaque do not — a real modality bias (PCCT lower). The bias grew v1→v2 (07-07 re-work) and persists on the sub-segment (raw column), so it is within the shared centerline, not the traced-extent tail.</w:t>
+        <w:t>Note: on the OQ-comparable canonical length-normalized basis, CALC and LRNC overlap the OQ bias CI (v2), while NonCALC Matrix and Total Plaque do not — a real modality bias (PCCT lower). The bias grew v1→v2 (07-07 re-work). Length-normalized per-mm values carry each read's traced extent (as in the OQ); the raw-mm³ columns and the extent-matched sub-segment (§6/§7) disentangle composition from extent.</w:t>
       </w:r>
     </w:p>
     <w:p>

</xml_diff>

<commit_message>
Stat doc §7: show scanner-attributable on the variance (σ²) scale
Replaced the floored wCV% display (lower CI always clamped to 0 because variance is
non-negative) with σ²_scanner = Var(d_log)/2 − σ²_OQ and its bootstrap 95% CI on the
variance scale, where the estimate and lower bound can be negative — making the
'indistinguishable from zero' result legible (e.g. NonCALC v2 +0.0148 [-0.0006,+0.0289]).
a: σ²_scanner ≤ σ²_OQ, b: CI∋0 verdicts retained; floored wCV% remains in
gate_results/scanner_attributable_subsegment.csv. PPT slide updated to match.

Co-Authored-By: Claude Opus 4.8 (1M context) <noreply@anthropic.com>
</commit_message>
<xml_diff>
--- a/PCCT_Statistical_Methods_and_Results.docx
+++ b/PCCT_Statistical_Methods_and_Results.docx
@@ -4083,7 +4083,7 @@
         <w:pStyle w:val="Heading1"/>
       </w:pPr>
       <w:r>
-        <w:t>7. Scanner-attributable variance vs OQ — SUB-SEGMENT (a: wCV≤OQ, b: CI∋0)</w:t>
+        <w:t>7. Scanner-attributable variance vs OQ — SUB-SEGMENT (variance scale; a: σ²_scan ≤ σ²_OQ, b: CI∋0)</w:t>
       </w:r>
     </w:p>
     <w:tbl>
@@ -4125,7 +4125,7 @@
                 <w:b/>
                 <w:sz w:val="18"/>
               </w:rPr>
-              <w:t>OQ limit</w:t>
+              <w:t>σ²_OQ</w:t>
             </w:r>
           </w:p>
         </w:tc>
@@ -4140,7 +4140,7 @@
                 <w:b/>
                 <w:sz w:val="18"/>
               </w:rPr>
-              <w:t>v1 sub-seg</w:t>
+              <w:t>v1 sub-seg σ²_scanner [95% CI]  a/b</w:t>
             </w:r>
           </w:p>
         </w:tc>
@@ -4155,7 +4155,7 @@
                 <w:b/>
                 <w:sz w:val="18"/>
               </w:rPr>
-              <w:t>v2 sub-seg</w:t>
+              <w:t>v2 sub-seg σ²_scanner [95% CI]  a/b</w:t>
             </w:r>
           </w:p>
         </w:tc>
@@ -4185,7 +4185,7 @@
               <w:rPr>
                 <w:sz w:val="18"/>
               </w:rPr>
-              <w:t>7.5</w:t>
+              <w:t>0.0056</w:t>
             </w:r>
           </w:p>
         </w:tc>
@@ -4199,7 +4199,7 @@
               <w:rPr>
                 <w:sz w:val="18"/>
               </w:rPr>
-              <w:t>6.6 P/P</w:t>
+              <w:t>+0.0043 [-0.0007,+0.0101] P/P</w:t>
             </w:r>
           </w:p>
         </w:tc>
@@ -4213,7 +4213,7 @@
               <w:rPr>
                 <w:sz w:val="18"/>
               </w:rPr>
-              <w:t>6.9 P/P</w:t>
+              <w:t>+0.0048 [-0.0012,+0.0113] P/P</w:t>
             </w:r>
           </w:p>
         </w:tc>
@@ -4243,7 +4243,7 @@
               <w:rPr>
                 <w:sz w:val="18"/>
               </w:rPr>
-              <w:t>13.1</w:t>
+              <w:t>0.0170</w:t>
             </w:r>
           </w:p>
         </w:tc>
@@ -4257,7 +4257,7 @@
               <w:rPr>
                 <w:sz w:val="18"/>
               </w:rPr>
-              <w:t>0.0 P/P</w:t>
+              <w:t>-0.0027 [-0.0091,+0.0028] P/P</w:t>
             </w:r>
           </w:p>
         </w:tc>
@@ -4271,7 +4271,7 @@
               <w:rPr>
                 <w:sz w:val="18"/>
               </w:rPr>
-              <w:t>0.0 P/P</w:t>
+              <w:t>-0.0002 [-0.0096,+0.0099] P/P</w:t>
             </w:r>
           </w:p>
         </w:tc>
@@ -4301,7 +4301,7 @@
               <w:rPr>
                 <w:sz w:val="18"/>
               </w:rPr>
-              <w:t>8.7</w:t>
+              <w:t>0.0075</w:t>
             </w:r>
           </w:p>
         </w:tc>
@@ -4315,7 +4315,7 @@
               <w:rPr>
                 <w:sz w:val="18"/>
               </w:rPr>
-              <w:t>2.5 P/P</w:t>
+              <w:t>+0.0006 [-0.0027,+0.0037] P/P</w:t>
             </w:r>
           </w:p>
         </w:tc>
@@ -4329,7 +4329,7 @@
               <w:rPr>
                 <w:sz w:val="18"/>
               </w:rPr>
-              <w:t>2.2 P/P</w:t>
+              <w:t>+0.0005 [-0.0033,+0.0047] P/P</w:t>
             </w:r>
           </w:p>
         </w:tc>
@@ -4359,7 +4359,7 @@
               <w:rPr>
                 <w:sz w:val="18"/>
               </w:rPr>
-              <w:t>4.5</w:t>
+              <w:t>0.0020</w:t>
             </w:r>
           </w:p>
         </w:tc>
@@ -4373,7 +4373,7 @@
               <w:rPr>
                 <w:sz w:val="18"/>
               </w:rPr>
-              <w:t>2.7 P/P</w:t>
+              <w:t>+0.0007 [-0.0007,+0.0019] P/P</w:t>
             </w:r>
           </w:p>
         </w:tc>
@@ -4387,7 +4387,7 @@
               <w:rPr>
                 <w:sz w:val="18"/>
               </w:rPr>
-              <w:t>4.5 F/P</w:t>
+              <w:t>+0.0021 [-0.0008,+0.0051] F/P</w:t>
             </w:r>
           </w:p>
         </w:tc>
@@ -4417,7 +4417,7 @@
               <w:rPr>
                 <w:sz w:val="18"/>
               </w:rPr>
-              <w:t>5.4</w:t>
+              <w:t>0.0029</w:t>
             </w:r>
           </w:p>
         </w:tc>
@@ -4431,7 +4431,7 @@
               <w:rPr>
                 <w:sz w:val="18"/>
               </w:rPr>
-              <w:t>7.7 F/P</w:t>
+              <w:t>+0.0059 [-0.0014,+0.0180] F/P</w:t>
             </w:r>
           </w:p>
         </w:tc>
@@ -4445,7 +4445,7 @@
               <w:rPr>
                 <w:sz w:val="18"/>
               </w:rPr>
-              <w:t>3.2 P/P</w:t>
+              <w:t>+0.0010 [-0.0021,+0.0060] P/P</w:t>
             </w:r>
           </w:p>
         </w:tc>
@@ -4475,7 +4475,7 @@
               <w:rPr>
                 <w:sz w:val="18"/>
               </w:rPr>
-              <w:t>13.6</w:t>
+              <w:t>0.0183</w:t>
             </w:r>
           </w:p>
         </w:tc>
@@ -4489,7 +4489,7 @@
               <w:rPr>
                 <w:sz w:val="18"/>
               </w:rPr>
-              <w:t>10.2 P/P</w:t>
+              <w:t>+0.0103 [-0.0024,+0.0240] P/P</w:t>
             </w:r>
           </w:p>
         </w:tc>
@@ -4503,7 +4503,7 @@
               <w:rPr>
                 <w:sz w:val="18"/>
               </w:rPr>
-              <w:t>12.2 P/P</w:t>
+              <w:t>+0.0148 [-0.0006,+0.0289] P/P</w:t>
             </w:r>
           </w:p>
         </w:tc>
@@ -4533,7 +4533,7 @@
               <w:rPr>
                 <w:sz w:val="18"/>
               </w:rPr>
-              <w:t>13.2</w:t>
+              <w:t>0.0173</w:t>
             </w:r>
           </w:p>
         </w:tc>
@@ -4547,7 +4547,7 @@
               <w:rPr>
                 <w:sz w:val="18"/>
               </w:rPr>
-              <w:t>6.3 P/P</w:t>
+              <w:t>+0.0040 [-0.0052,+0.0128] P/P</w:t>
             </w:r>
           </w:p>
         </w:tc>
@@ -4561,7 +4561,7 @@
               <w:rPr>
                 <w:sz w:val="18"/>
               </w:rPr>
-              <w:t>8.6 P/P</w:t>
+              <w:t>+0.0074 [-0.0061,+0.0214] P/P</w:t>
             </w:r>
           </w:p>
         </w:tc>
@@ -4573,7 +4573,7 @@
           <w:b w:val="0"/>
           <w:i/>
         </w:rPr>
-        <w:t>Cells: scanner-attributable wCV%  a/b (P/F), on the extent-matched sub-segment. σ²_scanner = Var(d_log)/2 − σ²_OQ; with reader+repeat (OQ) and extent (sub-segment) removed, the residual scanner-attributable variability is ≤ OQ / CI-includes-0 for nearly all endpoints.</w:t>
+        <w:t>Cells: scanner-attributable variance σ²_scanner = Var(d_log)/2 − σ²_OQ (log scale) with bootstrap 95% CI, on the extent-matched sub-segment. a: σ²_scanner ≤ σ²_OQ (P/F); b: CI includes 0 (P/F). On the variance scale the estimate and its CI lower bound can be NEGATIVE — a negative value / lower bound ≤ 0 means the residual cross-scanner variance is indistinguishable from (or below) the OQ reader+repeat variance. (The equivalent floored wCV% = √(exp(max(σ²,0))−1)×100 is in gate_results/scanner_attributable_subsegment.csv.) After removing reader+repeat (OQ) and traced extent (sub-segment), σ²_scanner is ≤ σ²_OQ and CI-includes-0 for nearly all endpoints.</w:t>
       </w:r>
     </w:p>
     <w:p>

</xml_diff>